<commit_message>
feat: manuscript with rendered Mermaid diagrams (IPO, AIDLC, Gantt)
- Converted 3 ASCII diagrams to Mermaid → rendered PNG images
- IPO diagram (Figure 1): Input→Process→Output flow
- AIDLC phases (Figure 2): Inception→Construction→Operations
- Project Gantt chart (Figure 3): May-Aug 2026 timeline
- Images inserted inline with bold figure captions
- ASCII art/code blocks/notes fully stripped from manuscript
- Clean 94 paragraphs, 9,178 words, 3 images
</commit_message>
<xml_diff>
--- a/capstone/SecureCAT_Ch1_Ch2_Manuscript.docx
+++ b/capstone/SecureCAT_Ch1_Ch2_Manuscript.docx
@@ -401,6 +401,75 @@
     </w:p>
     <w:p>
       <w:pPr>
+        <w:jc w:val="center"/>
+      </w:pPr>
+      <w:r>
+        <w:drawing>
+          <wp:inline xmlns:a="http://schemas.openxmlformats.org/drawingml/2006/main" xmlns:pic="http://schemas.openxmlformats.org/drawingml/2006/picture">
+            <wp:extent cx="5303520" cy="2421761"/>
+            <wp:docPr id="1" name="Picture 1"/>
+            <wp:cNvGraphicFramePr>
+              <a:graphicFrameLocks noChangeAspect="1"/>
+            </wp:cNvGraphicFramePr>
+            <a:graphic>
+              <a:graphicData uri="http://schemas.openxmlformats.org/drawingml/2006/picture">
+                <pic:pic>
+                  <pic:nvPicPr>
+                    <pic:cNvPr id="0" name="ipo_diagram.png"/>
+                    <pic:cNvPicPr/>
+                  </pic:nvPicPr>
+                  <pic:blipFill>
+                    <a:blip r:embed="rId14"/>
+                    <a:stretch>
+                      <a:fillRect/>
+                    </a:stretch>
+                  </pic:blipFill>
+                  <pic:spPr>
+                    <a:xfrm>
+                      <a:off x="0" y="0"/>
+                      <a:ext cx="5303520" cy="2421761"/>
+                    </a:xfrm>
+                    <a:prstGeom prst="rect"/>
+                  </pic:spPr>
+                </pic:pic>
+              </a:graphicData>
+            </a:graphic>
+          </wp:inline>
+        </w:drawing>
+      </w:r>
+    </w:p>
+    <w:p>
+      <w:pPr>
+        <w:jc w:val="center"/>
+        <w:spacing w:line="480" w:lineRule="auto" w:after="0"/>
+      </w:pPr>
+      <w:r>
+        <w:rPr>
+          <w:rFonts w:ascii="Times New Roman" w:hAnsi="Times New Roman" w:cs="Times New Roman"/>
+          <w:rFonts w:ascii="Times New Roman" w:hAnsi="Times New Roman"/>
+          <w:b/>
+          <w:sz w:val="24"/>
+        </w:rPr>
+        <w:t>Figure 1. Conceptual Framework Diagram (Input-Process-Output) of SecureCAT: A Role-Based College Admission Testing System for the Guidance and Registrar Offices at ISPSC Tagudin</w:t>
+      </w:r>
+    </w:p>
+    <w:p>
+      <w:pPr>
+        <w:jc w:val="both"/>
+        <w:spacing w:line="480" w:lineRule="auto" w:after="0"/>
+      </w:pPr>
+      <w:r>
+        <w:rPr>
+          <w:rFonts w:ascii="Times New Roman" w:hAnsi="Times New Roman" w:cs="Times New Roman"/>
+          <w:rFonts w:ascii="Times New Roman" w:hAnsi="Times New Roman"/>
+          <w:b/>
+          <w:sz w:val="24"/>
+        </w:rPr>
+        <w:t>Narrative</w:t>
+      </w:r>
+    </w:p>
+    <w:p>
+      <w:pPr>
         <w:jc w:val="both"/>
         <w:spacing w:line="480" w:lineRule="auto" w:after="0"/>
         <w:ind w:firstLine="285750"/>
@@ -412,7 +481,7 @@
           <w:b w:val="0"/>
           <w:sz w:val="24"/>
         </w:rPr>
-        <w:t>```</w:t>
+        <w:t>The system receives six distinct categories of input that collectively drive the admission testing pipeline at ISPSC Tagudin. Applicant data, comprising personal information, academic preferences, application forms, general weighted average records, and course selections, enters the system during the enrollment phase and forms the foundation upon which all downstream processing depends. Exam configurations, which include aptitude area definitions, scoring formulas, rating scales, session parameters, and academic year settings, define the structural and evaluative rules the system applies when administering and grading tests. OMR images and scans—representing a new capability introduced by SecureCAT to replace ISPSC's current manual scoring workflow—capture physical answer sheet photographs and bubble sheet scans for computer-vision-based grading, alongside machine-readable CSV score imports, providing the raw score source material that the automated scoring pipeline consumes. Role credentials encompass user authentication data, role-based access tokens, Google OAuth identifiers, and proctor and administrator authorization credentials, which the system uses to enforce access boundaries through Laravel policy classes and zero-trust data governance. QR scans capture examinee QR code reads at exam room doors for attendance verification, identity confirmation, and session check-in, including during offline periods where data is persisted locally in IndexedDB. Natural language queries from applicants, covering questions about admission requirements, course recommendations, exam schedules, and institutional policies, are submitted to the AI Companion, which processes them through retrieval-augmented generation using local vector embeddings to produce contextually relevant responses. Together, these six input categories supply the data, configuration, authentication, and interaction signals that SecureCAT requires to execute its role-based admission testing workflow across the Guidance and Registrar Offices.</w:t>
       </w:r>
     </w:p>
     <w:p>
@@ -428,7 +497,37 @@
           <w:b w:val="0"/>
           <w:sz w:val="24"/>
         </w:rPr>
-        <w:t>┌─────────────────────────────────────────────────────────────────────────────────┐</w:t>
+        <w:t>The system transforms these inputs through a coordinated set of mechanisms that enforce role-based access control with zero-trust data governance, ensuring that each authenticated user interacts only with the data and operations their assigned role permits. Cryptographic score integrity is maintained via HMAC-SHA256 signature verification, which locks finalized scores against unauthorized modification, while immutable write-only audit logging—a new system capability—captures every security-sensitive action with actor identity, IP address, user agent, and before-and-after database state snapshots. The automated scoring pipeline processes OMR images through computer-vision ingestion and CSV imports, applying the scoring formulas and rating scales defined in the exam configurations to produce per-applicant score breakdowns, percentile rankings, and component-level performance reports; raw scores are then mapped to standardized scores via the conversion table defined in the simulation guide [SIM-GUID-23], ensuring consistent and reproducible scaling across exam sessions. Offline-resilient proctoring operates through a Progressive Web App with Service Workers and IndexedDB caching, allowing proctors to continue scanning QR codes and confirming attendance even when campus connectivity is unreliable, with background synchronization restoring records once network access resumes. AI-assisted operations—a new system capability—use retrieval-augmented generation with local vector embeddings to power the AI Companion for applicant guidance and course recommendations, while the enhanced AI-assisted scheduling system generates optimized session proposals for registrar admin review through a human-in-the-loop constraint engine. Multi-tenant database isolation segregates tenant data in conformance with the Philippine Data Privacy Act (Republic Act No. 10173), preparing the architecture for future campus expansion. Through these mechanisms, the system produces nine categories of output: real-time status tracking displays that visualize the applicant lifecycle from submission through result release; exam schedules with session assignments, room allocations, and proctor assignments; score reports with per-applicant aptitude breakdowns; immutable audit logs with full action provenance; customizable result sheets in single, bulk PDF, and bulk DOCX formats with dynamic watermarks; consultation summaries documenting counselor notes and course recommendations; AI Companion responses delivering natural language answers and intelligent course recommendations; offline-cached records persisted in IndexedDB and synchronized upon reconnection; and statistical reports with admission analytics and exportable data for institutional reporting.</w:t>
+      </w:r>
+    </w:p>
+    <w:p>
+      <w:pPr>
+        <w:jc w:val="both"/>
+        <w:spacing w:line="480" w:lineRule="auto" w:after="0"/>
+      </w:pPr>
+      <w:r>
+        <w:rPr>
+          <w:rFonts w:ascii="Times New Roman" w:hAnsi="Times New Roman" w:cs="Times New Roman"/>
+          <w:rFonts w:ascii="Times New Roman" w:hAnsi="Times New Roman"/>
+          <w:b/>
+          <w:sz w:val="24"/>
+        </w:rPr>
+        <w:t>Objectives of the Study</w:t>
+      </w:r>
+    </w:p>
+    <w:p>
+      <w:pPr>
+        <w:jc w:val="both"/>
+        <w:spacing w:line="480" w:lineRule="auto" w:after="0"/>
+      </w:pPr>
+      <w:r>
+        <w:rPr>
+          <w:rFonts w:ascii="Times New Roman" w:hAnsi="Times New Roman" w:cs="Times New Roman"/>
+          <w:rFonts w:ascii="Times New Roman" w:hAnsi="Times New Roman"/>
+          <w:b/>
+          <w:sz w:val="24"/>
+        </w:rPr>
+        <w:t>General Objective</w:t>
       </w:r>
     </w:p>
     <w:p>
@@ -444,7 +543,22 @@
           <w:b w:val="0"/>
           <w:sz w:val="24"/>
         </w:rPr>
-        <w:t>│                              INPUT                                               │</w:t>
+        <w:t>This study aims to develop SecureCAT: A Role-Based College Admission Testing System for the Guidance and Registrar Offices at ISPSC Tagudin, a web-based platform that centralizes and automates the entire admission testing pipeline — from applicant registration and dynamic room scheduling through proctor-monitored examination, automated scoring, result sheet generation, and AI-assisted counseling — while enforcing zero-trust data governance through cryptographic score integrity, immutable audit logging, and role-based access control designed to operate reliably under the infrastructure constraints specific to the Ilocos Sur Polytechnic State College Tagudin Campus.</w:t>
+      </w:r>
+    </w:p>
+    <w:p>
+      <w:pPr>
+        <w:jc w:val="both"/>
+        <w:spacing w:line="480" w:lineRule="auto" w:after="0"/>
+      </w:pPr>
+      <w:r>
+        <w:rPr>
+          <w:rFonts w:ascii="Times New Roman" w:hAnsi="Times New Roman" w:cs="Times New Roman"/>
+          <w:rFonts w:ascii="Times New Roman" w:hAnsi="Times New Roman"/>
+          <w:b/>
+          <w:sz w:val="24"/>
+        </w:rPr>
+        <w:t>Specific Objectives</w:t>
       </w:r>
     </w:p>
     <w:p>
@@ -460,1510 +574,7 @@
           <w:b w:val="0"/>
           <w:sz w:val="24"/>
         </w:rPr>
-        <w:t>│                                                                                 │</w:t>
-      </w:r>
-    </w:p>
-    <w:p>
-      <w:pPr>
-        <w:jc w:val="both"/>
-        <w:spacing w:line="480" w:lineRule="auto" w:after="0"/>
-        <w:ind w:firstLine="285750"/>
-      </w:pPr>
-      <w:r>
-        <w:rPr>
-          <w:rFonts w:ascii="Times New Roman" w:hAnsi="Times New Roman" w:cs="Times New Roman"/>
-          <w:rFonts w:ascii="Times New Roman" w:hAnsi="Times New Roman"/>
-          <w:b w:val="0"/>
-          <w:sz w:val="24"/>
-        </w:rPr>
-        <w:t>│   1. Applicant data                                                             │</w:t>
-      </w:r>
-    </w:p>
-    <w:p>
-      <w:pPr>
-        <w:jc w:val="both"/>
-        <w:spacing w:line="480" w:lineRule="auto" w:after="0"/>
-        <w:ind w:firstLine="285750"/>
-      </w:pPr>
-      <w:r>
-        <w:rPr>
-          <w:rFonts w:ascii="Times New Roman" w:hAnsi="Times New Roman" w:cs="Times New Roman"/>
-          <w:rFonts w:ascii="Times New Roman" w:hAnsi="Times New Roman"/>
-          <w:b w:val="0"/>
-          <w:sz w:val="24"/>
-        </w:rPr>
-        <w:t>│      (personal information, academic preferences, application forms,            │</w:t>
-      </w:r>
-    </w:p>
-    <w:p>
-      <w:pPr>
-        <w:jc w:val="both"/>
-        <w:spacing w:line="480" w:lineRule="auto" w:after="0"/>
-        <w:ind w:firstLine="285750"/>
-      </w:pPr>
-      <w:r>
-        <w:rPr>
-          <w:rFonts w:ascii="Times New Roman" w:hAnsi="Times New Roman" w:cs="Times New Roman"/>
-          <w:rFonts w:ascii="Times New Roman" w:hAnsi="Times New Roman"/>
-          <w:b w:val="0"/>
-          <w:sz w:val="24"/>
-        </w:rPr>
-        <w:t>│       GWA records, course selections)                                           │</w:t>
-      </w:r>
-    </w:p>
-    <w:p>
-      <w:pPr>
-        <w:jc w:val="both"/>
-        <w:spacing w:line="480" w:lineRule="auto" w:after="0"/>
-        <w:ind w:firstLine="285750"/>
-      </w:pPr>
-      <w:r>
-        <w:rPr>
-          <w:rFonts w:ascii="Times New Roman" w:hAnsi="Times New Roman" w:cs="Times New Roman"/>
-          <w:rFonts w:ascii="Times New Roman" w:hAnsi="Times New Roman"/>
-          <w:b w:val="0"/>
-          <w:sz w:val="24"/>
-        </w:rPr>
-        <w:t>│                                                                                 │</w:t>
-      </w:r>
-    </w:p>
-    <w:p>
-      <w:pPr>
-        <w:jc w:val="both"/>
-        <w:spacing w:line="480" w:lineRule="auto" w:after="0"/>
-        <w:ind w:firstLine="285750"/>
-      </w:pPr>
-      <w:r>
-        <w:rPr>
-          <w:rFonts w:ascii="Times New Roman" w:hAnsi="Times New Roman" w:cs="Times New Roman"/>
-          <w:rFonts w:ascii="Times New Roman" w:hAnsi="Times New Roman"/>
-          <w:b w:val="0"/>
-          <w:sz w:val="24"/>
-        </w:rPr>
-        <w:t>│   2. Exam configurations                                                        │</w:t>
-      </w:r>
-    </w:p>
-    <w:p>
-      <w:pPr>
-        <w:jc w:val="both"/>
-        <w:spacing w:line="480" w:lineRule="auto" w:after="0"/>
-        <w:ind w:firstLine="285750"/>
-      </w:pPr>
-      <w:r>
-        <w:rPr>
-          <w:rFonts w:ascii="Times New Roman" w:hAnsi="Times New Roman" w:cs="Times New Roman"/>
-          <w:rFonts w:ascii="Times New Roman" w:hAnsi="Times New Roman"/>
-          <w:b w:val="0"/>
-          <w:sz w:val="24"/>
-        </w:rPr>
-        <w:t>│      (aptitude area definitions, scoring formulas, rating scales,               │</w:t>
-      </w:r>
-    </w:p>
-    <w:p>
-      <w:pPr>
-        <w:jc w:val="both"/>
-        <w:spacing w:line="480" w:lineRule="auto" w:after="0"/>
-        <w:ind w:firstLine="285750"/>
-      </w:pPr>
-      <w:r>
-        <w:rPr>
-          <w:rFonts w:ascii="Times New Roman" w:hAnsi="Times New Roman" w:cs="Times New Roman"/>
-          <w:rFonts w:ascii="Times New Roman" w:hAnsi="Times New Roman"/>
-          <w:b w:val="0"/>
-          <w:sz w:val="24"/>
-        </w:rPr>
-        <w:t>│       session parameters, academic year settings)                               │</w:t>
-      </w:r>
-    </w:p>
-    <w:p>
-      <w:pPr>
-        <w:jc w:val="both"/>
-        <w:spacing w:line="480" w:lineRule="auto" w:after="0"/>
-        <w:ind w:firstLine="285750"/>
-      </w:pPr>
-      <w:r>
-        <w:rPr>
-          <w:rFonts w:ascii="Times New Roman" w:hAnsi="Times New Roman" w:cs="Times New Roman"/>
-          <w:rFonts w:ascii="Times New Roman" w:hAnsi="Times New Roman"/>
-          <w:b w:val="0"/>
-          <w:sz w:val="24"/>
-        </w:rPr>
-        <w:t>│                                                                                 │</w:t>
-      </w:r>
-    </w:p>
-    <w:p>
-      <w:pPr>
-        <w:jc w:val="both"/>
-        <w:spacing w:line="480" w:lineRule="auto" w:after="0"/>
-        <w:ind w:firstLine="285750"/>
-      </w:pPr>
-      <w:r>
-        <w:rPr>
-          <w:rFonts w:ascii="Times New Roman" w:hAnsi="Times New Roman" w:cs="Times New Roman"/>
-          <w:rFonts w:ascii="Times New Roman" w:hAnsi="Times New Roman"/>
-          <w:b w:val="0"/>
-          <w:sz w:val="24"/>
-        </w:rPr>
-        <w:t>│   3. OMR images/scans                                                           │</w:t>
-      </w:r>
-    </w:p>
-    <w:p>
-      <w:pPr>
-        <w:jc w:val="both"/>
-        <w:spacing w:line="480" w:lineRule="auto" w:after="0"/>
-        <w:ind w:firstLine="285750"/>
-      </w:pPr>
-      <w:r>
-        <w:rPr>
-          <w:rFonts w:ascii="Times New Roman" w:hAnsi="Times New Roman" w:cs="Times New Roman"/>
-          <w:rFonts w:ascii="Times New Roman" w:hAnsi="Times New Roman"/>
-          <w:b w:val="0"/>
-          <w:sz w:val="24"/>
-        </w:rPr>
-        <w:t>│      (physical answer sheet photographs, bubble sheet scans for                │</w:t>
-      </w:r>
-    </w:p>
-    <w:p>
-      <w:pPr>
-        <w:jc w:val="both"/>
-        <w:spacing w:line="480" w:lineRule="auto" w:after="0"/>
-        <w:ind w:firstLine="285750"/>
-      </w:pPr>
-      <w:r>
-        <w:rPr>
-          <w:rFonts w:ascii="Times New Roman" w:hAnsi="Times New Roman" w:cs="Times New Roman"/>
-          <w:rFonts w:ascii="Times New Roman" w:hAnsi="Times New Roman"/>
-          <w:b w:val="0"/>
-          <w:sz w:val="24"/>
-        </w:rPr>
-        <w:t>│       computer-vision-based grading and CSV score imports)                      │</w:t>
-      </w:r>
-    </w:p>
-    <w:p>
-      <w:pPr>
-        <w:jc w:val="both"/>
-        <w:spacing w:line="480" w:lineRule="auto" w:after="0"/>
-        <w:ind w:firstLine="285750"/>
-      </w:pPr>
-      <w:r>
-        <w:rPr>
-          <w:rFonts w:ascii="Times New Roman" w:hAnsi="Times New Roman" w:cs="Times New Roman"/>
-          <w:rFonts w:ascii="Times New Roman" w:hAnsi="Times New Roman"/>
-          <w:b w:val="0"/>
-          <w:sz w:val="24"/>
-        </w:rPr>
-        <w:t>│                                                                                 │</w:t>
-      </w:r>
-    </w:p>
-    <w:p>
-      <w:pPr>
-        <w:jc w:val="both"/>
-        <w:spacing w:line="480" w:lineRule="auto" w:after="0"/>
-        <w:ind w:firstLine="285750"/>
-      </w:pPr>
-      <w:r>
-        <w:rPr>
-          <w:rFonts w:ascii="Times New Roman" w:hAnsi="Times New Roman" w:cs="Times New Roman"/>
-          <w:rFonts w:ascii="Times New Roman" w:hAnsi="Times New Roman"/>
-          <w:b w:val="0"/>
-          <w:sz w:val="24"/>
-        </w:rPr>
-        <w:t>│   4. Role credentials                                                           │</w:t>
-      </w:r>
-    </w:p>
-    <w:p>
-      <w:pPr>
-        <w:jc w:val="both"/>
-        <w:spacing w:line="480" w:lineRule="auto" w:after="0"/>
-        <w:ind w:firstLine="285750"/>
-      </w:pPr>
-      <w:r>
-        <w:rPr>
-          <w:rFonts w:ascii="Times New Roman" w:hAnsi="Times New Roman" w:cs="Times New Roman"/>
-          <w:rFonts w:ascii="Times New Roman" w:hAnsi="Times New Roman"/>
-          <w:b w:val="0"/>
-          <w:sz w:val="24"/>
-        </w:rPr>
-        <w:t>│      (user authentication data, role-based access tokens, Google OAuth          │</w:t>
-      </w:r>
-    </w:p>
-    <w:p>
-      <w:pPr>
-        <w:jc w:val="both"/>
-        <w:spacing w:line="480" w:lineRule="auto" w:after="0"/>
-        <w:ind w:firstLine="285750"/>
-      </w:pPr>
-      <w:r>
-        <w:rPr>
-          <w:rFonts w:ascii="Times New Roman" w:hAnsi="Times New Roman" w:cs="Times New Roman"/>
-          <w:rFonts w:ascii="Times New Roman" w:hAnsi="Times New Roman"/>
-          <w:b w:val="0"/>
-          <w:sz w:val="24"/>
-        </w:rPr>
-        <w:t>│       identifiers, proctor and administrator authorization credentials)         │</w:t>
-      </w:r>
-    </w:p>
-    <w:p>
-      <w:pPr>
-        <w:jc w:val="both"/>
-        <w:spacing w:line="480" w:lineRule="auto" w:after="0"/>
-        <w:ind w:firstLine="285750"/>
-      </w:pPr>
-      <w:r>
-        <w:rPr>
-          <w:rFonts w:ascii="Times New Roman" w:hAnsi="Times New Roman" w:cs="Times New Roman"/>
-          <w:rFonts w:ascii="Times New Roman" w:hAnsi="Times New Roman"/>
-          <w:b w:val="0"/>
-          <w:sz w:val="24"/>
-        </w:rPr>
-        <w:t>│                                                                                 │</w:t>
-      </w:r>
-    </w:p>
-    <w:p>
-      <w:pPr>
-        <w:jc w:val="both"/>
-        <w:spacing w:line="480" w:lineRule="auto" w:after="0"/>
-        <w:ind w:firstLine="285750"/>
-      </w:pPr>
-      <w:r>
-        <w:rPr>
-          <w:rFonts w:ascii="Times New Roman" w:hAnsi="Times New Roman" w:cs="Times New Roman"/>
-          <w:rFonts w:ascii="Times New Roman" w:hAnsi="Times New Roman"/>
-          <w:b w:val="0"/>
-          <w:sz w:val="24"/>
-        </w:rPr>
-        <w:t>│   5. QR scans                                                                   │</w:t>
-      </w:r>
-    </w:p>
-    <w:p>
-      <w:pPr>
-        <w:jc w:val="both"/>
-        <w:spacing w:line="480" w:lineRule="auto" w:after="0"/>
-        <w:ind w:firstLine="285750"/>
-      </w:pPr>
-      <w:r>
-        <w:rPr>
-          <w:rFonts w:ascii="Times New Roman" w:hAnsi="Times New Roman" w:cs="Times New Roman"/>
-          <w:rFonts w:ascii="Times New Roman" w:hAnsi="Times New Roman"/>
-          <w:b w:val="0"/>
-          <w:sz w:val="24"/>
-        </w:rPr>
-        <w:t>│      (examinee QR code reads at exam room doors for attendance                  │</w:t>
-      </w:r>
-    </w:p>
-    <w:p>
-      <w:pPr>
-        <w:jc w:val="both"/>
-        <w:spacing w:line="480" w:lineRule="auto" w:after="0"/>
-        <w:ind w:firstLine="285750"/>
-      </w:pPr>
-      <w:r>
-        <w:rPr>
-          <w:rFonts w:ascii="Times New Roman" w:hAnsi="Times New Roman" w:cs="Times New Roman"/>
-          <w:rFonts w:ascii="Times New Roman" w:hAnsi="Times New Roman"/>
-          <w:b w:val="0"/>
-          <w:sz w:val="24"/>
-        </w:rPr>
-        <w:t>│       verification, identity confirmation, and session check-in)                │</w:t>
-      </w:r>
-    </w:p>
-    <w:p>
-      <w:pPr>
-        <w:jc w:val="both"/>
-        <w:spacing w:line="480" w:lineRule="auto" w:after="0"/>
-        <w:ind w:firstLine="285750"/>
-      </w:pPr>
-      <w:r>
-        <w:rPr>
-          <w:rFonts w:ascii="Times New Roman" w:hAnsi="Times New Roman" w:cs="Times New Roman"/>
-          <w:rFonts w:ascii="Times New Roman" w:hAnsi="Times New Roman"/>
-          <w:b w:val="0"/>
-          <w:sz w:val="24"/>
-        </w:rPr>
-        <w:t>│                                                                                 │</w:t>
-      </w:r>
-    </w:p>
-    <w:p>
-      <w:pPr>
-        <w:jc w:val="both"/>
-        <w:spacing w:line="480" w:lineRule="auto" w:after="0"/>
-        <w:ind w:firstLine="285750"/>
-      </w:pPr>
-      <w:r>
-        <w:rPr>
-          <w:rFonts w:ascii="Times New Roman" w:hAnsi="Times New Roman" w:cs="Times New Roman"/>
-          <w:rFonts w:ascii="Times New Roman" w:hAnsi="Times New Roman"/>
-          <w:b w:val="0"/>
-          <w:sz w:val="24"/>
-        </w:rPr>
-        <w:t>│   6. Natural language queries                                                   │</w:t>
-      </w:r>
-    </w:p>
-    <w:p>
-      <w:pPr>
-        <w:jc w:val="both"/>
-        <w:spacing w:line="480" w:lineRule="auto" w:after="0"/>
-        <w:ind w:firstLine="285750"/>
-      </w:pPr>
-      <w:r>
-        <w:rPr>
-          <w:rFonts w:ascii="Times New Roman" w:hAnsi="Times New Roman" w:cs="Times New Roman"/>
-          <w:rFonts w:ascii="Times New Roman" w:hAnsi="Times New Roman"/>
-          <w:b w:val="0"/>
-          <w:sz w:val="24"/>
-        </w:rPr>
-        <w:t>│      (applicant questions about admission requirements, course                  │</w:t>
-      </w:r>
-    </w:p>
-    <w:p>
-      <w:pPr>
-        <w:jc w:val="both"/>
-        <w:spacing w:line="480" w:lineRule="auto" w:after="0"/>
-        <w:ind w:firstLine="285750"/>
-      </w:pPr>
-      <w:r>
-        <w:rPr>
-          <w:rFonts w:ascii="Times New Roman" w:hAnsi="Times New Roman" w:cs="Times New Roman"/>
-          <w:rFonts w:ascii="Times New Roman" w:hAnsi="Times New Roman"/>
-          <w:b w:val="0"/>
-          <w:sz w:val="24"/>
-        </w:rPr>
-        <w:t>│       recommendations, exam schedules, and institutional policies               │</w:t>
-      </w:r>
-    </w:p>
-    <w:p>
-      <w:pPr>
-        <w:jc w:val="both"/>
-        <w:spacing w:line="480" w:lineRule="auto" w:after="0"/>
-        <w:ind w:firstLine="285750"/>
-      </w:pPr>
-      <w:r>
-        <w:rPr>
-          <w:rFonts w:ascii="Times New Roman" w:hAnsi="Times New Roman" w:cs="Times New Roman"/>
-          <w:rFonts w:ascii="Times New Roman" w:hAnsi="Times New Roman"/>
-          <w:b w:val="0"/>
-          <w:sz w:val="24"/>
-        </w:rPr>
-        <w:t>│       submitted to the AI Companion)                                            │</w:t>
-      </w:r>
-    </w:p>
-    <w:p>
-      <w:pPr>
-        <w:jc w:val="both"/>
-        <w:spacing w:line="480" w:lineRule="auto" w:after="0"/>
-        <w:ind w:firstLine="285750"/>
-      </w:pPr>
-      <w:r>
-        <w:rPr>
-          <w:rFonts w:ascii="Times New Roman" w:hAnsi="Times New Roman" w:cs="Times New Roman"/>
-          <w:rFonts w:ascii="Times New Roman" w:hAnsi="Times New Roman"/>
-          <w:b w:val="0"/>
-          <w:sz w:val="24"/>
-        </w:rPr>
-        <w:t>│                                                                                 │</w:t>
-      </w:r>
-    </w:p>
-    <w:p>
-      <w:pPr>
-        <w:jc w:val="both"/>
-        <w:spacing w:line="480" w:lineRule="auto" w:after="0"/>
-        <w:ind w:firstLine="285750"/>
-      </w:pPr>
-      <w:r>
-        <w:rPr>
-          <w:rFonts w:ascii="Times New Roman" w:hAnsi="Times New Roman" w:cs="Times New Roman"/>
-          <w:rFonts w:ascii="Times New Roman" w:hAnsi="Times New Roman"/>
-          <w:b w:val="0"/>
-          <w:sz w:val="24"/>
-        </w:rPr>
-        <w:t>└──────────────────────────────────┬──────────────────────────────────────────────┘</w:t>
-      </w:r>
-    </w:p>
-    <w:p>
-      <w:pPr>
-        <w:jc w:val="both"/>
-        <w:spacing w:line="480" w:lineRule="auto" w:after="0"/>
-        <w:ind w:firstLine="285750"/>
-      </w:pPr>
-      <w:r>
-        <w:rPr>
-          <w:rFonts w:ascii="Times New Roman" w:hAnsi="Times New Roman" w:cs="Times New Roman"/>
-          <w:rFonts w:ascii="Times New Roman" w:hAnsi="Times New Roman"/>
-          <w:b w:val="0"/>
-          <w:sz w:val="24"/>
-        </w:rPr>
-        <w:t>│</w:t>
-      </w:r>
-    </w:p>
-    <w:p>
-      <w:pPr>
-        <w:jc w:val="both"/>
-        <w:spacing w:line="480" w:lineRule="auto" w:after="0"/>
-        <w:ind w:firstLine="285750"/>
-      </w:pPr>
-      <w:r>
-        <w:rPr>
-          <w:rFonts w:ascii="Times New Roman" w:hAnsi="Times New Roman" w:cs="Times New Roman"/>
-          <w:rFonts w:ascii="Times New Roman" w:hAnsi="Times New Roman"/>
-          <w:b w:val="0"/>
-          <w:sz w:val="24"/>
-        </w:rPr>
-        <w:t>▼</w:t>
-      </w:r>
-    </w:p>
-    <w:p>
-      <w:pPr>
-        <w:jc w:val="both"/>
-        <w:spacing w:line="480" w:lineRule="auto" w:after="0"/>
-        <w:ind w:firstLine="285750"/>
-      </w:pPr>
-      <w:r>
-        <w:rPr>
-          <w:rFonts w:ascii="Times New Roman" w:hAnsi="Times New Roman" w:cs="Times New Roman"/>
-          <w:rFonts w:ascii="Times New Roman" w:hAnsi="Times New Roman"/>
-          <w:b w:val="0"/>
-          <w:sz w:val="24"/>
-        </w:rPr>
-        <w:t>┌─────────────────────────────────────────────────────────────────────────────────┐</w:t>
-      </w:r>
-    </w:p>
-    <w:p>
-      <w:pPr>
-        <w:jc w:val="both"/>
-        <w:spacing w:line="480" w:lineRule="auto" w:after="0"/>
-        <w:ind w:firstLine="285750"/>
-      </w:pPr>
-      <w:r>
-        <w:rPr>
-          <w:rFonts w:ascii="Times New Roman" w:hAnsi="Times New Roman" w:cs="Times New Roman"/>
-          <w:rFonts w:ascii="Times New Roman" w:hAnsi="Times New Roman"/>
-          <w:b w:val="0"/>
-          <w:sz w:val="24"/>
-        </w:rPr>
-        <w:t>│                              PROCESS                                            │</w:t>
-      </w:r>
-    </w:p>
-    <w:p>
-      <w:pPr>
-        <w:jc w:val="both"/>
-        <w:spacing w:line="480" w:lineRule="auto" w:after="0"/>
-        <w:ind w:firstLine="285750"/>
-      </w:pPr>
-      <w:r>
-        <w:rPr>
-          <w:rFonts w:ascii="Times New Roman" w:hAnsi="Times New Roman" w:cs="Times New Roman"/>
-          <w:rFonts w:ascii="Times New Roman" w:hAnsi="Times New Roman"/>
-          <w:b w:val="0"/>
-          <w:sz w:val="24"/>
-        </w:rPr>
-        <w:t>│                                                                                 │</w:t>
-      </w:r>
-    </w:p>
-    <w:p>
-      <w:pPr>
-        <w:jc w:val="both"/>
-        <w:spacing w:line="480" w:lineRule="auto" w:after="0"/>
-        <w:ind w:firstLine="285750"/>
-      </w:pPr>
-      <w:r>
-        <w:rPr>
-          <w:rFonts w:ascii="Times New Roman" w:hAnsi="Times New Roman" w:cs="Times New Roman"/>
-          <w:rFonts w:ascii="Times New Roman" w:hAnsi="Times New Roman"/>
-          <w:b w:val="0"/>
-          <w:sz w:val="24"/>
-        </w:rPr>
-        <w:t>│        SecureCAT: A Role-Based College Admission Testing System                 │</w:t>
-      </w:r>
-    </w:p>
-    <w:p>
-      <w:pPr>
-        <w:jc w:val="both"/>
-        <w:spacing w:line="480" w:lineRule="auto" w:after="0"/>
-        <w:ind w:firstLine="285750"/>
-      </w:pPr>
-      <w:r>
-        <w:rPr>
-          <w:rFonts w:ascii="Times New Roman" w:hAnsi="Times New Roman" w:cs="Times New Roman"/>
-          <w:rFonts w:ascii="Times New Roman" w:hAnsi="Times New Roman"/>
-          <w:b w:val="0"/>
-          <w:sz w:val="24"/>
-        </w:rPr>
-        <w:t>│           for the Guidance and Registrar Offices at ISPSC Tagudin               │</w:t>
-      </w:r>
-    </w:p>
-    <w:p>
-      <w:pPr>
-        <w:jc w:val="both"/>
-        <w:spacing w:line="480" w:lineRule="auto" w:after="0"/>
-        <w:ind w:firstLine="285750"/>
-      </w:pPr>
-      <w:r>
-        <w:rPr>
-          <w:rFonts w:ascii="Times New Roman" w:hAnsi="Times New Roman" w:cs="Times New Roman"/>
-          <w:rFonts w:ascii="Times New Roman" w:hAnsi="Times New Roman"/>
-          <w:b w:val="0"/>
-          <w:sz w:val="24"/>
-        </w:rPr>
-        <w:t>│                                                                                 │</w:t>
-      </w:r>
-    </w:p>
-    <w:p>
-      <w:pPr>
-        <w:jc w:val="both"/>
-        <w:spacing w:line="480" w:lineRule="auto" w:after="0"/>
-        <w:ind w:firstLine="285750"/>
-      </w:pPr>
-      <w:r>
-        <w:rPr>
-          <w:rFonts w:ascii="Times New Roman" w:hAnsi="Times New Roman" w:cs="Times New Roman"/>
-          <w:rFonts w:ascii="Times New Roman" w:hAnsi="Times New Roman"/>
-          <w:b w:val="0"/>
-          <w:sz w:val="24"/>
-        </w:rPr>
-        <w:t>│   • Role-based access control (RBAC) with zero-trust data governance            │</w:t>
-      </w:r>
-    </w:p>
-    <w:p>
-      <w:pPr>
-        <w:jc w:val="both"/>
-        <w:spacing w:line="480" w:lineRule="auto" w:after="0"/>
-        <w:ind w:firstLine="285750"/>
-      </w:pPr>
-      <w:r>
-        <w:rPr>
-          <w:rFonts w:ascii="Times New Roman" w:hAnsi="Times New Roman" w:cs="Times New Roman"/>
-          <w:rFonts w:ascii="Times New Roman" w:hAnsi="Times New Roman"/>
-          <w:b w:val="0"/>
-          <w:sz w:val="24"/>
-        </w:rPr>
-        <w:t>│   • Cryptographic score integrity via HMAC-SHA256 signature verification        │</w:t>
-      </w:r>
-    </w:p>
-    <w:p>
-      <w:pPr>
-        <w:jc w:val="both"/>
-        <w:spacing w:line="480" w:lineRule="auto" w:after="0"/>
-        <w:ind w:firstLine="285750"/>
-      </w:pPr>
-      <w:r>
-        <w:rPr>
-          <w:rFonts w:ascii="Times New Roman" w:hAnsi="Times New Roman" w:cs="Times New Roman"/>
-          <w:rFonts w:ascii="Times New Roman" w:hAnsi="Times New Roman"/>
-          <w:b w:val="0"/>
-          <w:sz w:val="24"/>
-        </w:rPr>
-        <w:t>│   • Immutable write-only audit logging with before/after state capture          │</w:t>
-      </w:r>
-    </w:p>
-    <w:p>
-      <w:pPr>
-        <w:jc w:val="both"/>
-        <w:spacing w:line="480" w:lineRule="auto" w:after="0"/>
-        <w:ind w:firstLine="285750"/>
-      </w:pPr>
-      <w:r>
-        <w:rPr>
-          <w:rFonts w:ascii="Times New Roman" w:hAnsi="Times New Roman" w:cs="Times New Roman"/>
-          <w:rFonts w:ascii="Times New Roman" w:hAnsi="Times New Roman"/>
-          <w:b w:val="0"/>
-          <w:sz w:val="24"/>
-        </w:rPr>
-        <w:t>│   • Automated scoring pipeline (CSV import, direct assessment,                  │</w:t>
-      </w:r>
-    </w:p>
-    <w:p>
-      <w:pPr>
-        <w:jc w:val="both"/>
-        <w:spacing w:line="480" w:lineRule="auto" w:after="0"/>
-        <w:ind w:firstLine="285750"/>
-      </w:pPr>
-      <w:r>
-        <w:rPr>
-          <w:rFonts w:ascii="Times New Roman" w:hAnsi="Times New Roman" w:cs="Times New Roman"/>
-          <w:rFonts w:ascii="Times New Roman" w:hAnsi="Times New Roman"/>
-          <w:b w:val="0"/>
-          <w:sz w:val="24"/>
-        </w:rPr>
-        <w:t>│     and planned computer-vision OMR ingestion)                                  │</w:t>
-      </w:r>
-    </w:p>
-    <w:p>
-      <w:pPr>
-        <w:jc w:val="both"/>
-        <w:spacing w:line="480" w:lineRule="auto" w:after="0"/>
-        <w:ind w:firstLine="285750"/>
-      </w:pPr>
-      <w:r>
-        <w:rPr>
-          <w:rFonts w:ascii="Times New Roman" w:hAnsi="Times New Roman" w:cs="Times New Roman"/>
-          <w:rFonts w:ascii="Times New Roman" w:hAnsi="Times New Roman"/>
-          <w:b w:val="0"/>
-          <w:sz w:val="24"/>
-        </w:rPr>
-        <w:t>│   • Offline-resilient proctoring via PWA with IndexedDB caching                 │</w:t>
-      </w:r>
-    </w:p>
-    <w:p>
-      <w:pPr>
-        <w:jc w:val="both"/>
-        <w:spacing w:line="480" w:lineRule="auto" w:after="0"/>
-        <w:ind w:firstLine="285750"/>
-      </w:pPr>
-      <w:r>
-        <w:rPr>
-          <w:rFonts w:ascii="Times New Roman" w:hAnsi="Times New Roman" w:cs="Times New Roman"/>
-          <w:rFonts w:ascii="Times New Roman" w:hAnsi="Times New Roman"/>
-          <w:b w:val="0"/>
-          <w:sz w:val="24"/>
-        </w:rPr>
-        <w:t>│     and background synchronization                                              │</w:t>
-      </w:r>
-    </w:p>
-    <w:p>
-      <w:pPr>
-        <w:jc w:val="both"/>
-        <w:spacing w:line="480" w:lineRule="auto" w:after="0"/>
-        <w:ind w:firstLine="285750"/>
-      </w:pPr>
-      <w:r>
-        <w:rPr>
-          <w:rFonts w:ascii="Times New Roman" w:hAnsi="Times New Roman" w:cs="Times New Roman"/>
-          <w:rFonts w:ascii="Times New Roman" w:hAnsi="Times New Roman"/>
-          <w:b w:val="0"/>
-          <w:sz w:val="24"/>
-        </w:rPr>
-        <w:t>│   • AI-assisted operations using retrieval-augmented generation (RAG)           │</w:t>
-      </w:r>
-    </w:p>
-    <w:p>
-      <w:pPr>
-        <w:jc w:val="both"/>
-        <w:spacing w:line="480" w:lineRule="auto" w:after="0"/>
-        <w:ind w:firstLine="285750"/>
-      </w:pPr>
-      <w:r>
-        <w:rPr>
-          <w:rFonts w:ascii="Times New Roman" w:hAnsi="Times New Roman" w:cs="Times New Roman"/>
-          <w:rFonts w:ascii="Times New Roman" w:hAnsi="Times New Roman"/>
-          <w:b w:val="0"/>
-          <w:sz w:val="24"/>
-        </w:rPr>
-        <w:t>│     with local vector embeddings for applicant guidance, course                 │</w:t>
-      </w:r>
-    </w:p>
-    <w:p>
-      <w:pPr>
-        <w:jc w:val="both"/>
-        <w:spacing w:line="480" w:lineRule="auto" w:after="0"/>
-        <w:ind w:firstLine="285750"/>
-      </w:pPr>
-      <w:r>
-        <w:rPr>
-          <w:rFonts w:ascii="Times New Roman" w:hAnsi="Times New Roman" w:cs="Times New Roman"/>
-          <w:rFonts w:ascii="Times New Roman" w:hAnsi="Times New Roman"/>
-          <w:b w:val="0"/>
-          <w:sz w:val="24"/>
-        </w:rPr>
-        <w:t>│     recommendations, and scheduling optimization                                │</w:t>
-      </w:r>
-    </w:p>
-    <w:p>
-      <w:pPr>
-        <w:jc w:val="both"/>
-        <w:spacing w:line="480" w:lineRule="auto" w:after="0"/>
-        <w:ind w:firstLine="285750"/>
-      </w:pPr>
-      <w:r>
-        <w:rPr>
-          <w:rFonts w:ascii="Times New Roman" w:hAnsi="Times New Roman" w:cs="Times New Roman"/>
-          <w:rFonts w:ascii="Times New Roman" w:hAnsi="Times New Roman"/>
-          <w:b w:val="0"/>
-          <w:sz w:val="24"/>
-        </w:rPr>
-        <w:t>│   • Multi-tenant database isolation architecture aligned with the               │</w:t>
-      </w:r>
-    </w:p>
-    <w:p>
-      <w:pPr>
-        <w:jc w:val="both"/>
-        <w:spacing w:line="480" w:lineRule="auto" w:after="0"/>
-        <w:ind w:firstLine="285750"/>
-      </w:pPr>
-      <w:r>
-        <w:rPr>
-          <w:rFonts w:ascii="Times New Roman" w:hAnsi="Times New Roman" w:cs="Times New Roman"/>
-          <w:rFonts w:ascii="Times New Roman" w:hAnsi="Times New Roman"/>
-          <w:b w:val="0"/>
-          <w:sz w:val="24"/>
-        </w:rPr>
-        <w:t>│     Philippine Data Privacy Act (RA 10173)                                      │</w:t>
-      </w:r>
-    </w:p>
-    <w:p>
-      <w:pPr>
-        <w:jc w:val="both"/>
-        <w:spacing w:line="480" w:lineRule="auto" w:after="0"/>
-        <w:ind w:firstLine="285750"/>
-      </w:pPr>
-      <w:r>
-        <w:rPr>
-          <w:rFonts w:ascii="Times New Roman" w:hAnsi="Times New Roman" w:cs="Times New Roman"/>
-          <w:rFonts w:ascii="Times New Roman" w:hAnsi="Times New Roman"/>
-          <w:b w:val="0"/>
-          <w:sz w:val="24"/>
-        </w:rPr>
-        <w:t>│                                                                                 │</w:t>
-      </w:r>
-    </w:p>
-    <w:p>
-      <w:pPr>
-        <w:jc w:val="both"/>
-        <w:spacing w:line="480" w:lineRule="auto" w:after="0"/>
-        <w:ind w:firstLine="285750"/>
-      </w:pPr>
-      <w:r>
-        <w:rPr>
-          <w:rFonts w:ascii="Times New Roman" w:hAnsi="Times New Roman" w:cs="Times New Roman"/>
-          <w:rFonts w:ascii="Times New Roman" w:hAnsi="Times New Roman"/>
-          <w:b w:val="0"/>
-          <w:sz w:val="24"/>
-        </w:rPr>
-        <w:t>└──────────────────────────────────┬──────────────────────────────────────────────┘</w:t>
-      </w:r>
-    </w:p>
-    <w:p>
-      <w:pPr>
-        <w:jc w:val="both"/>
-        <w:spacing w:line="480" w:lineRule="auto" w:after="0"/>
-        <w:ind w:firstLine="285750"/>
-      </w:pPr>
-      <w:r>
-        <w:rPr>
-          <w:rFonts w:ascii="Times New Roman" w:hAnsi="Times New Roman" w:cs="Times New Roman"/>
-          <w:rFonts w:ascii="Times New Roman" w:hAnsi="Times New Roman"/>
-          <w:b w:val="0"/>
-          <w:sz w:val="24"/>
-        </w:rPr>
-        <w:t>│</w:t>
-      </w:r>
-    </w:p>
-    <w:p>
-      <w:pPr>
-        <w:jc w:val="both"/>
-        <w:spacing w:line="480" w:lineRule="auto" w:after="0"/>
-        <w:ind w:firstLine="285750"/>
-      </w:pPr>
-      <w:r>
-        <w:rPr>
-          <w:rFonts w:ascii="Times New Roman" w:hAnsi="Times New Roman" w:cs="Times New Roman"/>
-          <w:rFonts w:ascii="Times New Roman" w:hAnsi="Times New Roman"/>
-          <w:b w:val="0"/>
-          <w:sz w:val="24"/>
-        </w:rPr>
-        <w:t>▼</w:t>
-      </w:r>
-    </w:p>
-    <w:p>
-      <w:pPr>
-        <w:jc w:val="both"/>
-        <w:spacing w:line="480" w:lineRule="auto" w:after="0"/>
-        <w:ind w:firstLine="285750"/>
-      </w:pPr>
-      <w:r>
-        <w:rPr>
-          <w:rFonts w:ascii="Times New Roman" w:hAnsi="Times New Roman" w:cs="Times New Roman"/>
-          <w:rFonts w:ascii="Times New Roman" w:hAnsi="Times New Roman"/>
-          <w:b w:val="0"/>
-          <w:sz w:val="24"/>
-        </w:rPr>
-        <w:t>┌─────────────────────────────────────────────────────────────────────────────────┐</w:t>
-      </w:r>
-    </w:p>
-    <w:p>
-      <w:pPr>
-        <w:jc w:val="both"/>
-        <w:spacing w:line="480" w:lineRule="auto" w:after="0"/>
-        <w:ind w:firstLine="285750"/>
-      </w:pPr>
-      <w:r>
-        <w:rPr>
-          <w:rFonts w:ascii="Times New Roman" w:hAnsi="Times New Roman" w:cs="Times New Roman"/>
-          <w:rFonts w:ascii="Times New Roman" w:hAnsi="Times New Roman"/>
-          <w:b w:val="0"/>
-          <w:sz w:val="24"/>
-        </w:rPr>
-        <w:t>│                              OUTPUT                                             │</w:t>
-      </w:r>
-    </w:p>
-    <w:p>
-      <w:pPr>
-        <w:jc w:val="both"/>
-        <w:spacing w:line="480" w:lineRule="auto" w:after="0"/>
-        <w:ind w:firstLine="285750"/>
-      </w:pPr>
-      <w:r>
-        <w:rPr>
-          <w:rFonts w:ascii="Times New Roman" w:hAnsi="Times New Roman" w:cs="Times New Roman"/>
-          <w:rFonts w:ascii="Times New Roman" w:hAnsi="Times New Roman"/>
-          <w:b w:val="0"/>
-          <w:sz w:val="24"/>
-        </w:rPr>
-        <w:t>│                                                                                 │</w:t>
-      </w:r>
-    </w:p>
-    <w:p>
-      <w:pPr>
-        <w:jc w:val="both"/>
-        <w:spacing w:line="480" w:lineRule="auto" w:after="0"/>
-        <w:ind w:firstLine="285750"/>
-      </w:pPr>
-      <w:r>
-        <w:rPr>
-          <w:rFonts w:ascii="Times New Roman" w:hAnsi="Times New Roman" w:cs="Times New Roman"/>
-          <w:rFonts w:ascii="Times New Roman" w:hAnsi="Times New Roman"/>
-          <w:b w:val="0"/>
-          <w:sz w:val="24"/>
-        </w:rPr>
-        <w:t>│   1. Status tracking displays                                                   │</w:t>
-      </w:r>
-    </w:p>
-    <w:p>
-      <w:pPr>
-        <w:jc w:val="both"/>
-        <w:spacing w:line="480" w:lineRule="auto" w:after="0"/>
-        <w:ind w:firstLine="285750"/>
-      </w:pPr>
-      <w:r>
-        <w:rPr>
-          <w:rFonts w:ascii="Times New Roman" w:hAnsi="Times New Roman" w:cs="Times New Roman"/>
-          <w:rFonts w:ascii="Times New Roman" w:hAnsi="Times New Roman"/>
-          <w:b w:val="0"/>
-          <w:sz w:val="24"/>
-        </w:rPr>
-        <w:t>│      (real-time applicant lifecycle visualization from application              │</w:t>
-      </w:r>
-    </w:p>
-    <w:p>
-      <w:pPr>
-        <w:jc w:val="both"/>
-        <w:spacing w:line="480" w:lineRule="auto" w:after="0"/>
-        <w:ind w:firstLine="285750"/>
-      </w:pPr>
-      <w:r>
-        <w:rPr>
-          <w:rFonts w:ascii="Times New Roman" w:hAnsi="Times New Roman" w:cs="Times New Roman"/>
-          <w:rFonts w:ascii="Times New Roman" w:hAnsi="Times New Roman"/>
-          <w:b w:val="0"/>
-          <w:sz w:val="24"/>
-        </w:rPr>
-        <w:t>│       submission through result release)                                        │</w:t>
-      </w:r>
-    </w:p>
-    <w:p>
-      <w:pPr>
-        <w:jc w:val="both"/>
-        <w:spacing w:line="480" w:lineRule="auto" w:after="0"/>
-        <w:ind w:firstLine="285750"/>
-      </w:pPr>
-      <w:r>
-        <w:rPr>
-          <w:rFonts w:ascii="Times New Roman" w:hAnsi="Times New Roman" w:cs="Times New Roman"/>
-          <w:rFonts w:ascii="Times New Roman" w:hAnsi="Times New Roman"/>
-          <w:b w:val="0"/>
-          <w:sz w:val="24"/>
-        </w:rPr>
-        <w:t>│                                                                                 │</w:t>
-      </w:r>
-    </w:p>
-    <w:p>
-      <w:pPr>
-        <w:jc w:val="both"/>
-        <w:spacing w:line="480" w:lineRule="auto" w:after="0"/>
-        <w:ind w:firstLine="285750"/>
-      </w:pPr>
-      <w:r>
-        <w:rPr>
-          <w:rFonts w:ascii="Times New Roman" w:hAnsi="Times New Roman" w:cs="Times New Roman"/>
-          <w:rFonts w:ascii="Times New Roman" w:hAnsi="Times New Roman"/>
-          <w:b w:val="0"/>
-          <w:sz w:val="24"/>
-        </w:rPr>
-        <w:t>│   2. Exam schedules                                                             │</w:t>
-      </w:r>
-    </w:p>
-    <w:p>
-      <w:pPr>
-        <w:jc w:val="both"/>
-        <w:spacing w:line="480" w:lineRule="auto" w:after="0"/>
-        <w:ind w:firstLine="285750"/>
-      </w:pPr>
-      <w:r>
-        <w:rPr>
-          <w:rFonts w:ascii="Times New Roman" w:hAnsi="Times New Roman" w:cs="Times New Roman"/>
-          <w:rFonts w:ascii="Times New Roman" w:hAnsi="Times New Roman"/>
-          <w:b w:val="0"/>
-          <w:sz w:val="24"/>
-        </w:rPr>
-        <w:t>│      (session assignments, room allocations, proctor assignments,               │</w:t>
-      </w:r>
-    </w:p>
-    <w:p>
-      <w:pPr>
-        <w:jc w:val="both"/>
-        <w:spacing w:line="480" w:lineRule="auto" w:after="0"/>
-        <w:ind w:firstLine="285750"/>
-      </w:pPr>
-      <w:r>
-        <w:rPr>
-          <w:rFonts w:ascii="Times New Roman" w:hAnsi="Times New Roman" w:cs="Times New Roman"/>
-          <w:rFonts w:ascii="Times New Roman" w:hAnsi="Times New Roman"/>
-          <w:b w:val="0"/>
-          <w:sz w:val="24"/>
-        </w:rPr>
-        <w:t>│       and time slot configurations)                                             │</w:t>
-      </w:r>
-    </w:p>
-    <w:p>
-      <w:pPr>
-        <w:jc w:val="both"/>
-        <w:spacing w:line="480" w:lineRule="auto" w:after="0"/>
-        <w:ind w:firstLine="285750"/>
-      </w:pPr>
-      <w:r>
-        <w:rPr>
-          <w:rFonts w:ascii="Times New Roman" w:hAnsi="Times New Roman" w:cs="Times New Roman"/>
-          <w:rFonts w:ascii="Times New Roman" w:hAnsi="Times New Roman"/>
-          <w:b w:val="0"/>
-          <w:sz w:val="24"/>
-        </w:rPr>
-        <w:t>│                                                                                 │</w:t>
-      </w:r>
-    </w:p>
-    <w:p>
-      <w:pPr>
-        <w:jc w:val="both"/>
-        <w:spacing w:line="480" w:lineRule="auto" w:after="0"/>
-        <w:ind w:firstLine="285750"/>
-      </w:pPr>
-      <w:r>
-        <w:rPr>
-          <w:rFonts w:ascii="Times New Roman" w:hAnsi="Times New Roman" w:cs="Times New Roman"/>
-          <w:rFonts w:ascii="Times New Roman" w:hAnsi="Times New Roman"/>
-          <w:b w:val="0"/>
-          <w:sz w:val="24"/>
-        </w:rPr>
-        <w:t>│   3. Score reports                                                              │</w:t>
-      </w:r>
-    </w:p>
-    <w:p>
-      <w:pPr>
-        <w:jc w:val="both"/>
-        <w:spacing w:line="480" w:lineRule="auto" w:after="0"/>
-        <w:ind w:firstLine="285750"/>
-      </w:pPr>
-      <w:r>
-        <w:rPr>
-          <w:rFonts w:ascii="Times New Roman" w:hAnsi="Times New Roman" w:cs="Times New Roman"/>
-          <w:rFonts w:ascii="Times New Roman" w:hAnsi="Times New Roman"/>
-          <w:b w:val="0"/>
-          <w:sz w:val="24"/>
-        </w:rPr>
-        <w:t>│      (per-applicant aptitude scores, percentile rankings, and                   │</w:t>
-      </w:r>
-    </w:p>
-    <w:p>
-      <w:pPr>
-        <w:jc w:val="both"/>
-        <w:spacing w:line="480" w:lineRule="auto" w:after="0"/>
-        <w:ind w:firstLine="285750"/>
-      </w:pPr>
-      <w:r>
-        <w:rPr>
-          <w:rFonts w:ascii="Times New Roman" w:hAnsi="Times New Roman" w:cs="Times New Roman"/>
-          <w:rFonts w:ascii="Times New Roman" w:hAnsi="Times New Roman"/>
-          <w:b w:val="0"/>
-          <w:sz w:val="24"/>
-        </w:rPr>
-        <w:t>│       component-level performance breakdowns)                                   │</w:t>
-      </w:r>
-    </w:p>
-    <w:p>
-      <w:pPr>
-        <w:jc w:val="both"/>
-        <w:spacing w:line="480" w:lineRule="auto" w:after="0"/>
-        <w:ind w:firstLine="285750"/>
-      </w:pPr>
-      <w:r>
-        <w:rPr>
-          <w:rFonts w:ascii="Times New Roman" w:hAnsi="Times New Roman" w:cs="Times New Roman"/>
-          <w:rFonts w:ascii="Times New Roman" w:hAnsi="Times New Roman"/>
-          <w:b w:val="0"/>
-          <w:sz w:val="24"/>
-        </w:rPr>
-        <w:t>│                                                                                 │</w:t>
-      </w:r>
-    </w:p>
-    <w:p>
-      <w:pPr>
-        <w:jc w:val="both"/>
-        <w:spacing w:line="480" w:lineRule="auto" w:after="0"/>
-        <w:ind w:firstLine="285750"/>
-      </w:pPr>
-      <w:r>
-        <w:rPr>
-          <w:rFonts w:ascii="Times New Roman" w:hAnsi="Times New Roman" w:cs="Times New Roman"/>
-          <w:rFonts w:ascii="Times New Roman" w:hAnsi="Times New Roman"/>
-          <w:b w:val="0"/>
-          <w:sz w:val="24"/>
-        </w:rPr>
-        <w:t>│   4. Audit logs                                                                 │</w:t>
-      </w:r>
-    </w:p>
-    <w:p>
-      <w:pPr>
-        <w:jc w:val="both"/>
-        <w:spacing w:line="480" w:lineRule="auto" w:after="0"/>
-        <w:ind w:firstLine="285750"/>
-      </w:pPr>
-      <w:r>
-        <w:rPr>
-          <w:rFonts w:ascii="Times New Roman" w:hAnsi="Times New Roman" w:cs="Times New Roman"/>
-          <w:rFonts w:ascii="Times New Roman" w:hAnsi="Times New Roman"/>
-          <w:b w:val="0"/>
-          <w:sz w:val="24"/>
-        </w:rPr>
-        <w:t>│      (immutable, append-only records of security-sensitive actions              │</w:t>
-      </w:r>
-    </w:p>
-    <w:p>
-      <w:pPr>
-        <w:jc w:val="both"/>
-        <w:spacing w:line="480" w:lineRule="auto" w:after="0"/>
-        <w:ind w:firstLine="285750"/>
-      </w:pPr>
-      <w:r>
-        <w:rPr>
-          <w:rFonts w:ascii="Times New Roman" w:hAnsi="Times New Roman" w:cs="Times New Roman"/>
-          <w:rFonts w:ascii="Times New Roman" w:hAnsi="Times New Roman"/>
-          <w:b w:val="0"/>
-          <w:sz w:val="24"/>
-        </w:rPr>
-        <w:t>│       with actor identity, IP address, user agent, and before/after             │</w:t>
-      </w:r>
-    </w:p>
-    <w:p>
-      <w:pPr>
-        <w:jc w:val="both"/>
-        <w:spacing w:line="480" w:lineRule="auto" w:after="0"/>
-        <w:ind w:firstLine="285750"/>
-      </w:pPr>
-      <w:r>
-        <w:rPr>
-          <w:rFonts w:ascii="Times New Roman" w:hAnsi="Times New Roman" w:cs="Times New Roman"/>
-          <w:rFonts w:ascii="Times New Roman" w:hAnsi="Times New Roman"/>
-          <w:b w:val="0"/>
-          <w:sz w:val="24"/>
-        </w:rPr>
-        <w:t>│       database snapshots)                                                       │</w:t>
-      </w:r>
-    </w:p>
-    <w:p>
-      <w:pPr>
-        <w:jc w:val="both"/>
-        <w:spacing w:line="480" w:lineRule="auto" w:after="0"/>
-        <w:ind w:firstLine="285750"/>
-      </w:pPr>
-      <w:r>
-        <w:rPr>
-          <w:rFonts w:ascii="Times New Roman" w:hAnsi="Times New Roman" w:cs="Times New Roman"/>
-          <w:rFonts w:ascii="Times New Roman" w:hAnsi="Times New Roman"/>
-          <w:b w:val="0"/>
-          <w:sz w:val="24"/>
-        </w:rPr>
-        <w:t>│                                                                                 │</w:t>
-      </w:r>
-    </w:p>
-    <w:p>
-      <w:pPr>
-        <w:jc w:val="both"/>
-        <w:spacing w:line="480" w:lineRule="auto" w:after="0"/>
-        <w:ind w:firstLine="285750"/>
-      </w:pPr>
-      <w:r>
-        <w:rPr>
-          <w:rFonts w:ascii="Times New Roman" w:hAnsi="Times New Roman" w:cs="Times New Roman"/>
-          <w:rFonts w:ascii="Times New Roman" w:hAnsi="Times New Roman"/>
-          <w:b w:val="0"/>
-          <w:sz w:val="24"/>
-        </w:rPr>
-        <w:t>│   5. Result sheets/PDFs                                                         │</w:t>
-      </w:r>
-    </w:p>
-    <w:p>
-      <w:pPr>
-        <w:jc w:val="both"/>
-        <w:spacing w:line="480" w:lineRule="auto" w:after="0"/>
-        <w:ind w:firstLine="285750"/>
-      </w:pPr>
-      <w:r>
-        <w:rPr>
-          <w:rFonts w:ascii="Times New Roman" w:hAnsi="Times New Roman" w:cs="Times New Roman"/>
-          <w:rFonts w:ascii="Times New Roman" w:hAnsi="Times New Roman"/>
-          <w:b w:val="0"/>
-          <w:sz w:val="24"/>
-        </w:rPr>
-        <w:t>│      (customizable, print-ready result documents with dynamic                   │</w:t>
-      </w:r>
-    </w:p>
-    <w:p>
-      <w:pPr>
-        <w:jc w:val="both"/>
-        <w:spacing w:line="480" w:lineRule="auto" w:after="0"/>
-        <w:ind w:firstLine="285750"/>
-      </w:pPr>
-      <w:r>
-        <w:rPr>
-          <w:rFonts w:ascii="Times New Roman" w:hAnsi="Times New Roman" w:cs="Times New Roman"/>
-          <w:rFonts w:ascii="Times New Roman" w:hAnsi="Times New Roman"/>
-          <w:b w:val="0"/>
-          <w:sz w:val="24"/>
-        </w:rPr>
-        <w:t>│       watermarks in single, bulk PDF, and bulk DOCX formats)                    │</w:t>
-      </w:r>
-    </w:p>
-    <w:p>
-      <w:pPr>
-        <w:jc w:val="both"/>
-        <w:spacing w:line="480" w:lineRule="auto" w:after="0"/>
-        <w:ind w:firstLine="285750"/>
-      </w:pPr>
-      <w:r>
-        <w:rPr>
-          <w:rFonts w:ascii="Times New Roman" w:hAnsi="Times New Roman" w:cs="Times New Roman"/>
-          <w:rFonts w:ascii="Times New Roman" w:hAnsi="Times New Roman"/>
-          <w:b w:val="0"/>
-          <w:sz w:val="24"/>
-        </w:rPr>
-        <w:t>│                                                                                 │</w:t>
-      </w:r>
-    </w:p>
-    <w:p>
-      <w:pPr>
-        <w:jc w:val="both"/>
-        <w:spacing w:line="480" w:lineRule="auto" w:after="0"/>
-        <w:ind w:firstLine="285750"/>
-      </w:pPr>
-      <w:r>
-        <w:rPr>
-          <w:rFonts w:ascii="Times New Roman" w:hAnsi="Times New Roman" w:cs="Times New Roman"/>
-          <w:rFonts w:ascii="Times New Roman" w:hAnsi="Times New Roman"/>
-          <w:b w:val="0"/>
-          <w:sz w:val="24"/>
-        </w:rPr>
-        <w:t>│   6. Consultation summaries                                                     │</w:t>
-      </w:r>
-    </w:p>
-    <w:p>
-      <w:pPr>
-        <w:jc w:val="both"/>
-        <w:spacing w:line="480" w:lineRule="auto" w:after="0"/>
-        <w:ind w:firstLine="285750"/>
-      </w:pPr>
-      <w:r>
-        <w:rPr>
-          <w:rFonts w:ascii="Times New Roman" w:hAnsi="Times New Roman" w:cs="Times New Roman"/>
-          <w:rFonts w:ascii="Times New Roman" w:hAnsi="Times New Roman"/>
-          <w:b w:val="0"/>
-          <w:sz w:val="24"/>
-        </w:rPr>
-        <w:t>│      (guidance counselor notes, course recommendations, and                     │</w:t>
-      </w:r>
-    </w:p>
-    <w:p>
-      <w:pPr>
-        <w:jc w:val="both"/>
-        <w:spacing w:line="480" w:lineRule="auto" w:after="0"/>
-        <w:ind w:firstLine="285750"/>
-      </w:pPr>
-      <w:r>
-        <w:rPr>
-          <w:rFonts w:ascii="Times New Roman" w:hAnsi="Times New Roman" w:cs="Times New Roman"/>
-          <w:rFonts w:ascii="Times New Roman" w:hAnsi="Times New Roman"/>
-          <w:b w:val="0"/>
-          <w:sz w:val="24"/>
-        </w:rPr>
-        <w:t>│       applicant disposition records)                                            │</w:t>
-      </w:r>
-    </w:p>
-    <w:p>
-      <w:pPr>
-        <w:jc w:val="both"/>
-        <w:spacing w:line="480" w:lineRule="auto" w:after="0"/>
-        <w:ind w:firstLine="285750"/>
-      </w:pPr>
-      <w:r>
-        <w:rPr>
-          <w:rFonts w:ascii="Times New Roman" w:hAnsi="Times New Roman" w:cs="Times New Roman"/>
-          <w:rFonts w:ascii="Times New Roman" w:hAnsi="Times New Roman"/>
-          <w:b w:val="0"/>
-          <w:sz w:val="24"/>
-        </w:rPr>
-        <w:t>│                                                                                 │</w:t>
-      </w:r>
-    </w:p>
-    <w:p>
-      <w:pPr>
-        <w:jc w:val="both"/>
-        <w:spacing w:line="480" w:lineRule="auto" w:after="0"/>
-        <w:ind w:firstLine="285750"/>
-      </w:pPr>
-      <w:r>
-        <w:rPr>
-          <w:rFonts w:ascii="Times New Roman" w:hAnsi="Times New Roman" w:cs="Times New Roman"/>
-          <w:rFonts w:ascii="Times New Roman" w:hAnsi="Times New Roman"/>
-          <w:b w:val="0"/>
-          <w:sz w:val="24"/>
-        </w:rPr>
-        <w:t>│   7. AI Companion responses                                                    │</w:t>
-      </w:r>
-    </w:p>
-    <w:p>
-      <w:pPr>
-        <w:jc w:val="both"/>
-        <w:spacing w:line="480" w:lineRule="auto" w:after="0"/>
-        <w:ind w:firstLine="285750"/>
-      </w:pPr>
-      <w:r>
-        <w:rPr>
-          <w:rFonts w:ascii="Times New Roman" w:hAnsi="Times New Roman" w:cs="Times New Roman"/>
-          <w:rFonts w:ascii="Times New Roman" w:hAnsi="Times New Roman"/>
-          <w:b w:val="0"/>
-          <w:sz w:val="24"/>
-        </w:rPr>
-        <w:t>│      (natural language answers to applicant inquiries, intelligent              │</w:t>
-      </w:r>
-    </w:p>
-    <w:p>
-      <w:pPr>
-        <w:jc w:val="both"/>
-        <w:spacing w:line="480" w:lineRule="auto" w:after="0"/>
-        <w:ind w:firstLine="285750"/>
-      </w:pPr>
-      <w:r>
-        <w:rPr>
-          <w:rFonts w:ascii="Times New Roman" w:hAnsi="Times New Roman" w:cs="Times New Roman"/>
-          <w:rFonts w:ascii="Times New Roman" w:hAnsi="Times New Roman"/>
-          <w:b w:val="0"/>
-          <w:sz w:val="24"/>
-        </w:rPr>
-        <w:t>│       course recommendations based on test results, and admission               │</w:t>
-      </w:r>
-    </w:p>
-    <w:p>
-      <w:pPr>
-        <w:jc w:val="both"/>
-        <w:spacing w:line="480" w:lineRule="auto" w:after="0"/>
-        <w:ind w:firstLine="285750"/>
-      </w:pPr>
-      <w:r>
-        <w:rPr>
-          <w:rFonts w:ascii="Times New Roman" w:hAnsi="Times New Roman" w:cs="Times New Roman"/>
-          <w:rFonts w:ascii="Times New Roman" w:hAnsi="Times New Roman"/>
-          <w:b w:val="0"/>
-          <w:sz w:val="24"/>
-        </w:rPr>
-        <w:t>│       guidance via RAG-powered conversational interface)                        │</w:t>
-      </w:r>
-    </w:p>
-    <w:p>
-      <w:pPr>
-        <w:jc w:val="both"/>
-        <w:spacing w:line="480" w:lineRule="auto" w:after="0"/>
-        <w:ind w:firstLine="285750"/>
-      </w:pPr>
-      <w:r>
-        <w:rPr>
-          <w:rFonts w:ascii="Times New Roman" w:hAnsi="Times New Roman" w:cs="Times New Roman"/>
-          <w:rFonts w:ascii="Times New Roman" w:hAnsi="Times New Roman"/>
-          <w:b w:val="0"/>
-          <w:sz w:val="24"/>
-        </w:rPr>
-        <w:t>│                                                                                 │</w:t>
-      </w:r>
-    </w:p>
-    <w:p>
-      <w:pPr>
-        <w:jc w:val="both"/>
-        <w:spacing w:line="480" w:lineRule="auto" w:after="0"/>
-        <w:ind w:firstLine="285750"/>
-      </w:pPr>
-      <w:r>
-        <w:rPr>
-          <w:rFonts w:ascii="Times New Roman" w:hAnsi="Times New Roman" w:cs="Times New Roman"/>
-          <w:rFonts w:ascii="Times New Roman" w:hAnsi="Times New Roman"/>
-          <w:b w:val="0"/>
-          <w:sz w:val="24"/>
-        </w:rPr>
-        <w:t>│   8. Offline-cached records                                                    │</w:t>
-      </w:r>
-    </w:p>
-    <w:p>
-      <w:pPr>
-        <w:jc w:val="both"/>
-        <w:spacing w:line="480" w:lineRule="auto" w:after="0"/>
-        <w:ind w:firstLine="285750"/>
-      </w:pPr>
-      <w:r>
-        <w:rPr>
-          <w:rFonts w:ascii="Times New Roman" w:hAnsi="Times New Roman" w:cs="Times New Roman"/>
-          <w:rFonts w:ascii="Times New Roman" w:hAnsi="Times New Roman"/>
-          <w:b w:val="0"/>
-          <w:sz w:val="24"/>
-        </w:rPr>
-        <w:t>│      (locally persisted QR scan data and attendance records in                  │</w:t>
-      </w:r>
-    </w:p>
-    <w:p>
-      <w:pPr>
-        <w:jc w:val="both"/>
-        <w:spacing w:line="480" w:lineRule="auto" w:after="0"/>
-        <w:ind w:firstLine="285750"/>
-      </w:pPr>
-      <w:r>
-        <w:rPr>
-          <w:rFonts w:ascii="Times New Roman" w:hAnsi="Times New Roman" w:cs="Times New Roman"/>
-          <w:rFonts w:ascii="Times New Roman" w:hAnsi="Times New Roman"/>
-          <w:b w:val="0"/>
-          <w:sz w:val="24"/>
-        </w:rPr>
-        <w:t>│       IndexedDB, synchronized upon network restoration)                         │</w:t>
-      </w:r>
-    </w:p>
-    <w:p>
-      <w:pPr>
-        <w:jc w:val="both"/>
-        <w:spacing w:line="480" w:lineRule="auto" w:after="0"/>
-        <w:ind w:firstLine="285750"/>
-      </w:pPr>
-      <w:r>
-        <w:rPr>
-          <w:rFonts w:ascii="Times New Roman" w:hAnsi="Times New Roman" w:cs="Times New Roman"/>
-          <w:rFonts w:ascii="Times New Roman" w:hAnsi="Times New Roman"/>
-          <w:b w:val="0"/>
-          <w:sz w:val="24"/>
-        </w:rPr>
-        <w:t>│                                                                                 │</w:t>
-      </w:r>
-    </w:p>
-    <w:p>
-      <w:pPr>
-        <w:jc w:val="both"/>
-        <w:spacing w:line="480" w:lineRule="auto" w:after="0"/>
-        <w:ind w:firstLine="285750"/>
-      </w:pPr>
-      <w:r>
-        <w:rPr>
-          <w:rFonts w:ascii="Times New Roman" w:hAnsi="Times New Roman" w:cs="Times New Roman"/>
-          <w:rFonts w:ascii="Times New Roman" w:hAnsi="Times New Roman"/>
-          <w:b w:val="0"/>
-          <w:sz w:val="24"/>
-        </w:rPr>
-        <w:t>│   9. Statistical reports                                                       │</w:t>
-      </w:r>
-    </w:p>
-    <w:p>
-      <w:pPr>
-        <w:jc w:val="both"/>
-        <w:spacing w:line="480" w:lineRule="auto" w:after="0"/>
-        <w:ind w:firstLine="285750"/>
-      </w:pPr>
-      <w:r>
-        <w:rPr>
-          <w:rFonts w:ascii="Times New Roman" w:hAnsi="Times New Roman" w:cs="Times New Roman"/>
-          <w:rFonts w:ascii="Times New Roman" w:hAnsi="Times New Roman"/>
-          <w:b w:val="0"/>
-          <w:sz w:val="24"/>
-        </w:rPr>
-        <w:t>│      (admission analytics, application pipeline metrics, and                    │</w:t>
-      </w:r>
-    </w:p>
-    <w:p>
-      <w:pPr>
-        <w:jc w:val="both"/>
-        <w:spacing w:line="480" w:lineRule="auto" w:after="0"/>
-        <w:ind w:firstLine="285750"/>
-      </w:pPr>
-      <w:r>
-        <w:rPr>
-          <w:rFonts w:ascii="Times New Roman" w:hAnsi="Times New Roman" w:cs="Times New Roman"/>
-          <w:rFonts w:ascii="Times New Roman" w:hAnsi="Times New Roman"/>
-          <w:b w:val="0"/>
-          <w:sz w:val="24"/>
-        </w:rPr>
-        <w:t>│       exportable CSV/Excel data for institutional reporting)                    │</w:t>
-      </w:r>
-    </w:p>
-    <w:p>
-      <w:pPr>
-        <w:jc w:val="both"/>
-        <w:spacing w:line="480" w:lineRule="auto" w:after="0"/>
-        <w:ind w:firstLine="285750"/>
-      </w:pPr>
-      <w:r>
-        <w:rPr>
-          <w:rFonts w:ascii="Times New Roman" w:hAnsi="Times New Roman" w:cs="Times New Roman"/>
-          <w:rFonts w:ascii="Times New Roman" w:hAnsi="Times New Roman"/>
-          <w:b w:val="0"/>
-          <w:sz w:val="24"/>
-        </w:rPr>
-        <w:t>│                                                                                 │</w:t>
-      </w:r>
-    </w:p>
-    <w:p>
-      <w:pPr>
-        <w:jc w:val="both"/>
-        <w:spacing w:line="480" w:lineRule="auto" w:after="0"/>
-        <w:ind w:firstLine="285750"/>
-      </w:pPr>
-      <w:r>
-        <w:rPr>
-          <w:rFonts w:ascii="Times New Roman" w:hAnsi="Times New Roman" w:cs="Times New Roman"/>
-          <w:rFonts w:ascii="Times New Roman" w:hAnsi="Times New Roman"/>
-          <w:b w:val="0"/>
-          <w:sz w:val="24"/>
-        </w:rPr>
-        <w:t>└─────────────────────────────────────────────────────────────────────────────────┘</w:t>
-      </w:r>
-    </w:p>
-    <w:p>
-      <w:pPr>
-        <w:jc w:val="both"/>
-        <w:spacing w:line="480" w:lineRule="auto" w:after="0"/>
-        <w:ind w:firstLine="285750"/>
-      </w:pPr>
-      <w:r>
-        <w:rPr>
-          <w:rFonts w:ascii="Times New Roman" w:hAnsi="Times New Roman" w:cs="Times New Roman"/>
-          <w:rFonts w:ascii="Times New Roman" w:hAnsi="Times New Roman"/>
-          <w:b w:val="0"/>
-          <w:sz w:val="24"/>
-        </w:rPr>
-        <w:t>```</w:t>
-      </w:r>
-    </w:p>
-    <w:p>
-      <w:pPr>
-        <w:jc w:val="both"/>
-        <w:spacing w:line="480" w:lineRule="auto" w:after="0"/>
-      </w:pPr>
-      <w:r>
-        <w:rPr>
-          <w:rFonts w:ascii="Times New Roman" w:hAnsi="Times New Roman" w:cs="Times New Roman"/>
-          <w:rFonts w:ascii="Times New Roman" w:hAnsi="Times New Roman"/>
-          <w:b/>
-          <w:sz w:val="24"/>
-        </w:rPr>
-        <w:t>Critical Evaluation Notes</w:t>
+        <w:t>More specifically, this study seeks to accomplish the following:</w:t>
       </w:r>
     </w:p>
     <w:p>
@@ -1979,7 +590,7 @@
           <w:sz w:val="24"/>
         </w:rPr>
         <w:tab/>
-        <w:t>1. *Inputs are THINGS the system receives, not processes.* Each input is a concrete data artifact or signal fed into the system. No process verbs (e.g., "scheduling," "grading," "tracking") appear in the input list — only the nouns representing what arrives at the system boundary.</w:t>
+        <w:t>1. Identify the existing admission testing processes, operational workflows, and confirmed process gaps at ISPSC Tagudin Campus — including manual scoring of answer sheets, informal and ad-hoc room scheduling, the absence of audit trails for score modifications, the lack of notification mechanisms for applicants and staff, and data privacy vulnerabilities under the Philippine Data Privacy Act (RA 10173) — alongside the current utilization of the deployed foundational digital system, role-based coordination requirements, infrastructure constraints, and baseline task workloads that necessitate a unified, cryptographically-secured, role-based digital platform bridging the Guidance Office and Registrar Office workflows.</w:t>
       </w:r>
     </w:p>
     <w:p>
@@ -1995,7 +606,7 @@
           <w:sz w:val="24"/>
         </w:rPr>
         <w:tab/>
-        <w:t>2. *Outputs are THINGS the system produces, not activities.* Each output is a tangible artifact the system generates. No action words describe how outputs are created — the transformation mechanics belong in the Process box and the C1-08 narrative.</w:t>
+        <w:t>2. Develop SecureCAT: A Role-Based College Admission Testing System for the Guidance and Registrar Offices at ISPSC Tagudin, incorporating role-based access control with RBAC-based proctor delegation and zero-trust data governance, cryptographic score integrity using HMAC-SHA256 signature verification, automated scoring with computer-vision-based OMR answer sheet ingestion as a new scanning capability, a live examination monitoring dashboard for real-time proctor oversight, an AI Companion powered by retrieval-augmented generation for applicant guidance and course recommendations, seat-quota management for room capacity enforcement during scheduling, offline-resilient proctoring via a Progressive Web App with IndexedDB caching and background synchronization, an enhanced AI-assisted scheduling system with human-in-the-loop constraint optimization, multi-tenant database isolation aligned with the Philippine Data Privacy Act (RA 10173), and validating the system's technical architecture through confusion matrix accuracy metrics for automated grading, expert rubric evaluation for AI faithfulness, and automated penetration and offline resilience audits.</w:t>
       </w:r>
     </w:p>
     <w:p>
@@ -2011,481 +622,7 @@
           <w:sz w:val="24"/>
         </w:rPr>
         <w:tab/>
-        <w:t>3. *Process box contains only the full system title.* Per GUIDE-2 and TEAM_META_GUIDE specifications, the center box names the system by its complete registered title. The sub-bullets inside the Process box provide the architectural mechanisms that transform inputs into outputs — these are the transformation verbs that are explicitly excluded from Input and Output boxes.</w:t>
-      </w:r>
-    </w:p>
-    <w:p>
-      <w:pPr>
-        <w:jc w:val="both"/>
-        <w:spacing w:line="480" w:lineRule="auto" w:after="0"/>
-      </w:pPr>
-      <w:r>
-        <w:rPr>
-          <w:rFonts w:ascii="Times New Roman" w:hAnsi="Times New Roman" w:cs="Times New Roman"/>
-          <w:rFonts w:ascii="Times New Roman" w:hAnsi="Times New Roman"/>
-          <w:b w:val="0"/>
-          <w:sz w:val="24"/>
-        </w:rPr>
-        <w:tab/>
-        <w:t>4. *Both existing and planned features are represented as ONE unified system.* The IPO diagram does not distinguish between "current" and "future" — it presents the complete system as designed, consistent with the conceptual framework requirement to describe the system holistically. The distinction between existing and planned scope is documented in `SYSTEM_FEATURES.md` and `Existing_and_Planned_Features.md`.</w:t>
-      </w:r>
-    </w:p>
-    <w:p>
-      <w:pPr>
-        <w:jc w:val="both"/>
-        <w:spacing w:line="480" w:lineRule="auto" w:after="0"/>
-      </w:pPr>
-      <w:r>
-        <w:rPr>
-          <w:rFonts w:ascii="Times New Roman" w:hAnsi="Times New Roman" w:cs="Times New Roman"/>
-          <w:rFonts w:ascii="Times New Roman" w:hAnsi="Times New Roman"/>
-          <w:b w:val="0"/>
-          <w:sz w:val="24"/>
-        </w:rPr>
-        <w:tab/>
-        <w:t>5. *6 inputs and 9 outputs match the TEAM_META_GUIDE specification exactly.* No additional items were added or removed. The descriptions inside each numbered item provide specificity without violating the input/output categorization rules.</w:t>
-      </w:r>
-    </w:p>
-    <w:p>
-      <w:pPr>
-        <w:jc w:val="both"/>
-        <w:spacing w:line="480" w:lineRule="auto" w:after="0"/>
-      </w:pPr>
-      <w:r>
-        <w:rPr>
-          <w:rFonts w:ascii="Times New Roman" w:hAnsi="Times New Roman" w:cs="Times New Roman"/>
-          <w:rFonts w:ascii="Times New Roman" w:hAnsi="Times New Roman"/>
-          <w:b/>
-          <w:sz w:val="24"/>
-        </w:rPr>
-        <w:t>Narrative</w:t>
-      </w:r>
-    </w:p>
-    <w:p>
-      <w:pPr>
-        <w:jc w:val="both"/>
-        <w:spacing w:line="480" w:lineRule="auto" w:after="0"/>
-        <w:ind w:firstLine="285750"/>
-      </w:pPr>
-      <w:r>
-        <w:rPr>
-          <w:rFonts w:ascii="Times New Roman" w:hAnsi="Times New Roman" w:cs="Times New Roman"/>
-          <w:rFonts w:ascii="Times New Roman" w:hAnsi="Times New Roman"/>
-          <w:b w:val="0"/>
-          <w:sz w:val="24"/>
-        </w:rPr>
-        <w:t>The system receives six distinct categories of input that collectively drive the admission testing pipeline at ISPSC Tagudin. Applicant data, comprising personal information, academic preferences, application forms, general weighted average records, and course selections, enters the system during the enrollment phase and forms the foundation upon which all downstream processing depends. Exam configurations, which include aptitude area definitions, scoring formulas, rating scales, session parameters, and academic year settings, define the structural and evaluative rules the system applies when administering and grading tests. OMR images and scans—representing a new capability introduced by SecureCAT to replace ISPSC's current manual scoring workflow—capture physical answer sheet photographs and bubble sheet scans for computer-vision-based grading, alongside machine-readable CSV score imports, providing the raw score source material that the automated scoring pipeline consumes. Role credentials encompass user authentication data, role-based access tokens, Google OAuth identifiers, and proctor and administrator authorization credentials, which the system uses to enforce access boundaries through Laravel policy classes and zero-trust data governance. QR scans capture examinee QR code reads at exam room doors for attendance verification, identity confirmation, and session check-in, including during offline periods where data is persisted locally in IndexedDB. Natural language queries from applicants, covering questions about admission requirements, course recommendations, exam schedules, and institutional policies, are submitted to the AI Companion, which processes them through retrieval-augmented generation using local vector embeddings to produce contextually relevant responses. Together, these six input categories supply the data, configuration, authentication, and interaction signals that SecureCAT requires to execute its role-based admission testing workflow across the Guidance and Registrar Offices.</w:t>
-      </w:r>
-    </w:p>
-    <w:p>
-      <w:pPr>
-        <w:jc w:val="both"/>
-        <w:spacing w:line="480" w:lineRule="auto" w:after="0"/>
-        <w:ind w:firstLine="285750"/>
-      </w:pPr>
-      <w:r>
-        <w:rPr>
-          <w:rFonts w:ascii="Times New Roman" w:hAnsi="Times New Roman" w:cs="Times New Roman"/>
-          <w:rFonts w:ascii="Times New Roman" w:hAnsi="Times New Roman"/>
-          <w:b w:val="0"/>
-          <w:sz w:val="24"/>
-        </w:rPr>
-        <w:t>The system transforms these inputs through a coordinated set of mechanisms that enforce role-based access control with zero-trust data governance, ensuring that each authenticated user interacts only with the data and operations their assigned role permits. Cryptographic score integrity is maintained via HMAC-SHA256 signature verification, which locks finalized scores against unauthorized modification, while immutable write-only audit logging—a new system capability—captures every security-sensitive action with actor identity, IP address, user agent, and before-and-after database state snapshots. The automated scoring pipeline processes OMR images through computer-vision ingestion and CSV imports, applying the scoring formulas and rating scales defined in the exam configurations to produce per-applicant score breakdowns, percentile rankings, and component-level performance reports; raw scores are then mapped to standardized scores via the conversion table defined in the simulation guide [SIM-GUID-23], ensuring consistent and reproducible scaling across exam sessions. Offline-resilient proctoring operates through a Progressive Web App with Service Workers and IndexedDB caching, allowing proctors to continue scanning QR codes and confirming attendance even when campus connectivity is unreliable, with background synchronization restoring records once network access resumes. AI-assisted operations—a new system capability—use retrieval-augmented generation with local vector embeddings to power the AI Companion for applicant guidance and course recommendations, while the enhanced AI-assisted scheduling system generates optimized session proposals for registrar admin review through a human-in-the-loop constraint engine. Multi-tenant database isolation segregates tenant data in conformance with the Philippine Data Privacy Act (Republic Act No. 10173), preparing the architecture for future campus expansion. Through these mechanisms, the system produces nine categories of output: real-time status tracking displays that visualize the applicant lifecycle from submission through result release; exam schedules with session assignments, room allocations, and proctor assignments; score reports with per-applicant aptitude breakdowns; immutable audit logs with full action provenance; customizable result sheets in single, bulk PDF, and bulk DOCX formats with dynamic watermarks; consultation summaries documenting counselor notes and course recommendations; AI Companion responses delivering natural language answers and intelligent course recommendations; offline-cached records persisted in IndexedDB and synchronized upon reconnection; and statistical reports with admission analytics and exportable data for institutional reporting.</w:t>
-      </w:r>
-    </w:p>
-    <w:p>
-      <w:pPr>
-        <w:jc w:val="both"/>
-        <w:spacing w:line="480" w:lineRule="auto" w:after="0"/>
-      </w:pPr>
-      <w:r>
-        <w:rPr>
-          <w:rFonts w:ascii="Times New Roman" w:hAnsi="Times New Roman" w:cs="Times New Roman"/>
-          <w:rFonts w:ascii="Times New Roman" w:hAnsi="Times New Roman"/>
-          <w:b/>
-          <w:sz w:val="24"/>
-        </w:rPr>
-        <w:t>Compliance Verification</w:t>
-      </w:r>
-    </w:p>
-    <w:p>
-      <w:pPr>
-        <w:jc w:val="both"/>
-        <w:spacing w:line="480" w:lineRule="auto" w:after="0"/>
-      </w:pPr>
-      <w:r>
-        <w:rPr>
-          <w:rFonts w:ascii="Times New Roman" w:hAnsi="Times New Roman" w:cs="Times New Roman"/>
-          <w:rFonts w:ascii="Times New Roman" w:hAnsi="Times New Roman"/>
-          <w:b/>
-          <w:sz w:val="24"/>
-        </w:rPr>
-        <w:t>Objectives of the Study</w:t>
-      </w:r>
-    </w:p>
-    <w:p>
-      <w:pPr>
-        <w:jc w:val="both"/>
-        <w:spacing w:line="480" w:lineRule="auto" w:after="0"/>
-      </w:pPr>
-      <w:r>
-        <w:rPr>
-          <w:rFonts w:ascii="Times New Roman" w:hAnsi="Times New Roman" w:cs="Times New Roman"/>
-          <w:rFonts w:ascii="Times New Roman" w:hAnsi="Times New Roman"/>
-          <w:b/>
-          <w:sz w:val="24"/>
-        </w:rPr>
-        <w:t>General Objective</w:t>
-      </w:r>
-    </w:p>
-    <w:p>
-      <w:pPr>
-        <w:jc w:val="both"/>
-        <w:spacing w:line="480" w:lineRule="auto" w:after="0"/>
-        <w:ind w:firstLine="285750"/>
-      </w:pPr>
-      <w:r>
-        <w:rPr>
-          <w:rFonts w:ascii="Times New Roman" w:hAnsi="Times New Roman" w:cs="Times New Roman"/>
-          <w:rFonts w:ascii="Times New Roman" w:hAnsi="Times New Roman"/>
-          <w:b w:val="0"/>
-          <w:sz w:val="24"/>
-        </w:rPr>
-        <w:t>This study aims to develop SecureCAT: A Role-Based College Admission Testing System for the Guidance and Registrar Offices at ISPSC Tagudin, a web-based platform that centralizes and automates the entire admission testing pipeline — from applicant registration and dynamic room scheduling through proctor-monitored examination, automated scoring, result sheet generation, and AI-assisted counseling — while enforcing zero-trust data governance through cryptographic score integrity, immutable audit logging, and role-based access control designed to operate reliably under the infrastructure constraints specific to the Ilocos Sur Polytechnic State College Tagudin Campus.</w:t>
-      </w:r>
-    </w:p>
-    <w:p>
-      <w:pPr>
-        <w:jc w:val="both"/>
-        <w:spacing w:line="480" w:lineRule="auto" w:after="0"/>
-      </w:pPr>
-      <w:r>
-        <w:rPr>
-          <w:rFonts w:ascii="Times New Roman" w:hAnsi="Times New Roman" w:cs="Times New Roman"/>
-          <w:rFonts w:ascii="Times New Roman" w:hAnsi="Times New Roman"/>
-          <w:b/>
-          <w:sz w:val="24"/>
-        </w:rPr>
-        <w:t>Specific Objectives</w:t>
-      </w:r>
-    </w:p>
-    <w:p>
-      <w:pPr>
-        <w:jc w:val="both"/>
-        <w:spacing w:line="480" w:lineRule="auto" w:after="0"/>
-        <w:ind w:firstLine="285750"/>
-      </w:pPr>
-      <w:r>
-        <w:rPr>
-          <w:rFonts w:ascii="Times New Roman" w:hAnsi="Times New Roman" w:cs="Times New Roman"/>
-          <w:rFonts w:ascii="Times New Roman" w:hAnsi="Times New Roman"/>
-          <w:b w:val="0"/>
-          <w:sz w:val="24"/>
-        </w:rPr>
-        <w:t>More specifically, this study seeks to accomplish the following:</w:t>
-      </w:r>
-    </w:p>
-    <w:p>
-      <w:pPr>
-        <w:jc w:val="both"/>
-        <w:spacing w:line="480" w:lineRule="auto" w:after="0"/>
-      </w:pPr>
-      <w:r>
-        <w:rPr>
-          <w:rFonts w:ascii="Times New Roman" w:hAnsi="Times New Roman" w:cs="Times New Roman"/>
-          <w:rFonts w:ascii="Times New Roman" w:hAnsi="Times New Roman"/>
-          <w:b w:val="0"/>
-          <w:sz w:val="24"/>
-        </w:rPr>
-        <w:tab/>
-        <w:t>1. *Identify* the existing admission testing processes, operational workflows, and confirmed process gaps at ISPSC Tagudin Campus — including manual scoring of answer sheets, informal and ad-hoc room scheduling, the absence of audit trails for score modifications, the lack of notification mechanisms for applicants and staff, and data privacy vulnerabilities under the Philippine Data Privacy Act (RA 10173) — alongside the current utilization of the deployed foundational digital system, role-based coordination requirements, infrastructure constraints, and baseline task workloads that necessitate a unified, cryptographically-secured, role-based digital platform bridging the Guidance Office and Registrar Office workflows.</w:t>
-      </w:r>
-    </w:p>
-    <w:p>
-      <w:pPr>
-        <w:jc w:val="both"/>
-        <w:spacing w:line="480" w:lineRule="auto" w:after="0"/>
-      </w:pPr>
-      <w:r>
-        <w:rPr>
-          <w:rFonts w:ascii="Times New Roman" w:hAnsi="Times New Roman" w:cs="Times New Roman"/>
-          <w:rFonts w:ascii="Times New Roman" w:hAnsi="Times New Roman"/>
-          <w:b w:val="0"/>
-          <w:sz w:val="24"/>
-        </w:rPr>
-        <w:tab/>
-        <w:t>2. *Develop* SecureCAT: A Role-Based College Admission Testing System for the Guidance and Registrar Offices at ISPSC Tagudin, incorporating role-based access control with RBAC-based proctor delegation and zero-trust data governance, cryptographic score integrity using HMAC-SHA256 signature verification, automated scoring with computer-vision-based OMR answer sheet ingestion as a new scanning capability, a live examination monitoring dashboard for real-time proctor oversight, an AI Companion powered by retrieval-augmented generation for applicant guidance and course recommendations, seat-quota management for room capacity enforcement during scheduling, offline-resilient proctoring via a Progressive Web App with IndexedDB caching and background synchronization, an enhanced AI-assisted scheduling system with human-in-the-loop constraint optimization, multi-tenant database isolation aligned with the Philippine Data Privacy Act (RA 10173), and validating the system's technical architecture through confusion matrix accuracy metrics for automated grading, expert rubric evaluation for AI faithfulness, and automated penetration and offline resilience audits.</w:t>
-      </w:r>
-    </w:p>
-    <w:p>
-      <w:pPr>
-        <w:jc w:val="both"/>
-        <w:spacing w:line="480" w:lineRule="auto" w:after="0"/>
-      </w:pPr>
-      <w:r>
-        <w:rPr>
-          <w:rFonts w:ascii="Times New Roman" w:hAnsi="Times New Roman" w:cs="Times New Roman"/>
-          <w:rFonts w:ascii="Times New Roman" w:hAnsi="Times New Roman"/>
-          <w:b w:val="0"/>
-          <w:sz w:val="24"/>
-        </w:rPr>
-        <w:tab/>
-        <w:t>3. *Evaluate* the usability and perceived task workload of the developed system using the System Usability Scale (SUS) and the NASA Task Load Index (NASA-TLX) as administered to intended users, including Registrar Office staff, Guidance Office counselors, proctors, test administrators, and applicants at ISPSC Tagudin Campus.</w:t>
-      </w:r>
-    </w:p>
-    <w:p>
-      <w:pPr>
-        <w:jc w:val="both"/>
-        <w:spacing w:line="480" w:lineRule="auto" w:after="0"/>
-      </w:pPr>
-      <w:r>
-        <w:rPr>
-          <w:rFonts w:ascii="Times New Roman" w:hAnsi="Times New Roman" w:cs="Times New Roman"/>
-          <w:rFonts w:ascii="Times New Roman" w:hAnsi="Times New Roman"/>
-          <w:b/>
-          <w:sz w:val="24"/>
-        </w:rPr>
-        <w:t>Critical Evaluation Notes</w:t>
-      </w:r>
-    </w:p>
-    <w:p>
-      <w:pPr>
-        <w:jc w:val="both"/>
-        <w:spacing w:line="480" w:lineRule="auto" w:after="0"/>
-        <w:ind w:firstLine="285750"/>
-      </w:pPr>
-      <w:r>
-        <w:rPr>
-          <w:rFonts w:ascii="Times New Roman" w:hAnsi="Times New Roman" w:cs="Times New Roman"/>
-          <w:rFonts w:ascii="Times New Roman" w:hAnsi="Times New Roman"/>
-          <w:b w:val="0"/>
-          <w:sz w:val="24"/>
-        </w:rPr>
-        <w:t>- Maps to Research Question 1 (operational needs + role-based access needs + security needs + resilience needs + baseline workload)</w:t>
-      </w:r>
-    </w:p>
-    <w:p>
-      <w:pPr>
-        <w:jc w:val="both"/>
-        <w:spacing w:line="480" w:lineRule="auto" w:after="0"/>
-        <w:ind w:firstLine="285750"/>
-      </w:pPr>
-      <w:r>
-        <w:rPr>
-          <w:rFonts w:ascii="Times New Roman" w:hAnsi="Times New Roman" w:cs="Times New Roman"/>
-          <w:rFonts w:ascii="Times New Roman" w:hAnsi="Times New Roman"/>
-          <w:b w:val="0"/>
-          <w:sz w:val="24"/>
-        </w:rPr>
-        <w:t>- Feeds into C2-01 (Research Design — descriptive component) and C2-07 (Data Analysis)</w:t>
-      </w:r>
-    </w:p>
-    <w:p>
-      <w:pPr>
-        <w:jc w:val="both"/>
-        <w:spacing w:line="480" w:lineRule="auto" w:after="0"/>
-        <w:ind w:firstLine="285750"/>
-      </w:pPr>
-      <w:r>
-        <w:rPr>
-          <w:rFonts w:ascii="Times New Roman" w:hAnsi="Times New Roman" w:cs="Times New Roman"/>
-          <w:rFonts w:ascii="Times New Roman" w:hAnsi="Times New Roman"/>
-          <w:b w:val="0"/>
-          <w:sz w:val="24"/>
-        </w:rPr>
-        <w:t>- Informs the "Identify" phase of the AIDLC/RAD methodology in Chapter 2</w:t>
-      </w:r>
-    </w:p>
-    <w:p>
-      <w:pPr>
-        <w:jc w:val="both"/>
-        <w:spacing w:line="480" w:lineRule="auto" w:after="0"/>
-        <w:ind w:firstLine="285750"/>
-      </w:pPr>
-      <w:r>
-        <w:rPr>
-          <w:rFonts w:ascii="Times New Roman" w:hAnsi="Times New Roman" w:cs="Times New Roman"/>
-          <w:rFonts w:ascii="Times New Roman" w:hAnsi="Times New Roman"/>
-          <w:b w:val="0"/>
-          <w:sz w:val="24"/>
-        </w:rPr>
-        <w:t>- "Current baseline task workloads" has been added to establish a "before" metric. You cannot prove that SecureCAT makes staff jobs easier unless you formally identify how difficult the manual process currently is.</w:t>
-      </w:r>
-    </w:p>
-    <w:p>
-      <w:pPr>
-        <w:jc w:val="both"/>
-        <w:spacing w:line="480" w:lineRule="auto" w:after="0"/>
-        <w:ind w:firstLine="285750"/>
-      </w:pPr>
-      <w:r>
-        <w:rPr>
-          <w:rFonts w:ascii="Times New Roman" w:hAnsi="Times New Roman" w:cs="Times New Roman"/>
-          <w:rFonts w:ascii="Times New Roman" w:hAnsi="Times New Roman"/>
-          <w:b w:val="0"/>
-          <w:sz w:val="24"/>
-        </w:rPr>
-        <w:t>- Maps to Research Question 2 (security needs + operational resilience needs + architectural requirements + technical validation)</w:t>
-      </w:r>
-    </w:p>
-    <w:p>
-      <w:pPr>
-        <w:jc w:val="both"/>
-        <w:spacing w:line="480" w:lineRule="auto" w:after="0"/>
-        <w:ind w:firstLine="285750"/>
-      </w:pPr>
-      <w:r>
-        <w:rPr>
-          <w:rFonts w:ascii="Times New Roman" w:hAnsi="Times New Roman" w:cs="Times New Roman"/>
-          <w:rFonts w:ascii="Times New Roman" w:hAnsi="Times New Roman"/>
-          <w:b w:val="0"/>
-          <w:sz w:val="24"/>
-        </w:rPr>
-        <w:t>- Feeds into C2-02 (Software Model), C2-03 (Project Plan), and the testing phases of Chapter 3</w:t>
-      </w:r>
-    </w:p>
-    <w:p>
-      <w:pPr>
-        <w:jc w:val="both"/>
-        <w:spacing w:line="480" w:lineRule="auto" w:after="0"/>
-        <w:ind w:firstLine="285750"/>
-      </w:pPr>
-      <w:r>
-        <w:rPr>
-          <w:rFonts w:ascii="Times New Roman" w:hAnsi="Times New Roman" w:cs="Times New Roman"/>
-          <w:rFonts w:ascii="Times New Roman" w:hAnsi="Times New Roman"/>
-          <w:b w:val="0"/>
-          <w:sz w:val="24"/>
-        </w:rPr>
-        <w:t>- Corresponds to the "Develop and Test" phases of the AIDLC/RAD methodology</w:t>
-      </w:r>
-    </w:p>
-    <w:p>
-      <w:pPr>
-        <w:jc w:val="both"/>
-        <w:spacing w:line="480" w:lineRule="auto" w:after="0"/>
-        <w:ind w:firstLine="285750"/>
-      </w:pPr>
-      <w:r>
-        <w:rPr>
-          <w:rFonts w:ascii="Times New Roman" w:hAnsi="Times New Roman" w:cs="Times New Roman"/>
-          <w:rFonts w:ascii="Times New Roman" w:hAnsi="Times New Roman"/>
-          <w:b w:val="0"/>
-          <w:sz w:val="24"/>
-        </w:rPr>
-        <w:t>- The technical validation metrics (Confusion Matrix, RAGAS-inspired expert rubric, Lighthouse/ZAP audits) are now explicitly woven into the development objective. This successfully shields these advanced engineering features from being judged by a simple usability survey. By categorizing them as "technical architecture validations," you prove they function correctly before the users ever see them.</w:t>
-      </w:r>
-    </w:p>
-    <w:p>
-      <w:pPr>
-        <w:jc w:val="both"/>
-        <w:spacing w:line="480" w:lineRule="auto" w:after="0"/>
-        <w:ind w:firstLine="285750"/>
-      </w:pPr>
-      <w:r>
-        <w:rPr>
-          <w:rFonts w:ascii="Times New Roman" w:hAnsi="Times New Roman" w:cs="Times New Roman"/>
-          <w:rFonts w:ascii="Times New Roman" w:hAnsi="Times New Roman"/>
-          <w:b w:val="0"/>
-          <w:sz w:val="24"/>
-        </w:rPr>
-        <w:t>- Maps to Research Question 3 (usability evaluation using SUS + workload evaluation using NASA-TLX)</w:t>
-      </w:r>
-    </w:p>
-    <w:p>
-      <w:pPr>
-        <w:jc w:val="both"/>
-        <w:spacing w:line="480" w:lineRule="auto" w:after="0"/>
-        <w:ind w:firstLine="285750"/>
-      </w:pPr>
-      <w:r>
-        <w:rPr>
-          <w:rFonts w:ascii="Times New Roman" w:hAnsi="Times New Roman" w:cs="Times New Roman"/>
-          <w:rFonts w:ascii="Times New Roman" w:hAnsi="Times New Roman"/>
-          <w:b w:val="0"/>
-          <w:sz w:val="24"/>
-        </w:rPr>
-        <w:t>- Feeds into C2-06 (Research Instruments — SUS and NASA-TLX questionnaires) and C2-07 (Data Analysis — Scoring comparisons)</w:t>
-      </w:r>
-    </w:p>
-    <w:p>
-      <w:pPr>
-        <w:jc w:val="both"/>
-        <w:spacing w:line="480" w:lineRule="auto" w:after="0"/>
-        <w:ind w:firstLine="285750"/>
-      </w:pPr>
-      <w:r>
-        <w:rPr>
-          <w:rFonts w:ascii="Times New Roman" w:hAnsi="Times New Roman" w:cs="Times New Roman"/>
-          <w:rFonts w:ascii="Times New Roman" w:hAnsi="Times New Roman"/>
-          <w:b w:val="0"/>
-          <w:sz w:val="24"/>
-        </w:rPr>
-        <w:t>- Corresponds to the "Evaluate" phase of the AIDLC/RAD methodology</w:t>
-      </w:r>
-    </w:p>
-    <w:p>
-      <w:pPr>
-        <w:jc w:val="both"/>
-        <w:spacing w:line="480" w:lineRule="auto" w:after="0"/>
-        <w:ind w:firstLine="285750"/>
-      </w:pPr>
-      <w:r>
-        <w:rPr>
-          <w:rFonts w:ascii="Times New Roman" w:hAnsi="Times New Roman" w:cs="Times New Roman"/>
-          <w:rFonts w:ascii="Times New Roman" w:hAnsi="Times New Roman"/>
-          <w:b w:val="0"/>
-          <w:sz w:val="24"/>
-        </w:rPr>
-        <w:t>- The structural rule is maintained: "usability" is used, and the forbidden word "acceptability" is strictly avoided.</w:t>
-      </w:r>
-    </w:p>
-    <w:p>
-      <w:pPr>
-        <w:jc w:val="both"/>
-        <w:spacing w:line="480" w:lineRule="auto" w:after="0"/>
-        <w:ind w:firstLine="285750"/>
-      </w:pPr>
-      <w:r>
-        <w:rPr>
-          <w:rFonts w:ascii="Times New Roman" w:hAnsi="Times New Roman" w:cs="Times New Roman"/>
-          <w:rFonts w:ascii="Times New Roman" w:hAnsi="Times New Roman"/>
-          <w:b w:val="0"/>
-          <w:sz w:val="24"/>
-        </w:rPr>
-        <w:t>- The addition of "perceived task workload" justifies the inclusion of the NASA Task Load Index. While the SUS proves the system is easy to learn and navigate, the NASA-TLX proves it actively reduces the mental, physical, and temporal frustration of the Guidance and Registrar staff.</w:t>
-      </w:r>
-    </w:p>
-    <w:p>
-      <w:pPr>
-        <w:jc w:val="both"/>
-        <w:spacing w:line="480" w:lineRule="auto" w:after="0"/>
-        <w:ind w:firstLine="285750"/>
-      </w:pPr>
-      <w:r>
-        <w:rPr>
-          <w:rFonts w:ascii="Times New Roman" w:hAnsi="Times New Roman" w:cs="Times New Roman"/>
-          <w:rFonts w:ascii="Times New Roman" w:hAnsi="Times New Roman"/>
-          <w:b w:val="0"/>
-          <w:sz w:val="24"/>
-        </w:rPr>
-        <w:t>The confirmed gaps and new capabilities cited in Objectives 1 and 2 are grounded in the following interview and observation evidence:</w:t>
-      </w:r>
-    </w:p>
-    <w:p>
-      <w:pPr>
-        <w:jc w:val="both"/>
-        <w:spacing w:line="480" w:lineRule="auto" w:after="0"/>
-        <w:ind w:firstLine="285750"/>
-      </w:pPr>
-      <w:r>
-        <w:rPr>
-          <w:rFonts w:ascii="Times New Roman" w:hAnsi="Times New Roman" w:cs="Times New Roman"/>
-          <w:rFonts w:ascii="Times New Roman" w:hAnsi="Times New Roman"/>
-          <w:b w:val="0"/>
-          <w:sz w:val="24"/>
-        </w:rPr>
-        <w:t>&gt; *Note:* This mapping is provided as a bridge to C1-10 (Research Questions). The exact question wording will be finalized in the C1-10 deliverable, but the one-to-one correspondence and dimension coverage are validated here to ensure C1-09 and C1-10 remain perfectly aligned.</w:t>
+        <w:t>3. Evaluate the usability and perceived task workload of the developed system using the System Usability Scale (SUS) and the NASA Task Load Index (NASA-TLX) as administered to intended users, including Registrar Office staff, Guidance Office counselors, proctors, test administrators, and applicants at ISPSC Tagudin Campus.</w:t>
       </w:r>
     </w:p>
     <w:p>
@@ -2564,36 +701,6 @@
           <w:b/>
           <w:sz w:val="24"/>
         </w:rPr>
-        <w:t>Compliance Verification</w:t>
-      </w:r>
-    </w:p>
-    <w:p>
-      <w:pPr>
-        <w:jc w:val="both"/>
-        <w:spacing w:line="480" w:lineRule="auto" w:after="0"/>
-      </w:pPr>
-      <w:r>
-        <w:rPr>
-          <w:rFonts w:ascii="Times New Roman" w:hAnsi="Times New Roman" w:cs="Times New Roman"/>
-          <w:rFonts w:ascii="Times New Roman" w:hAnsi="Times New Roman"/>
-          <w:b/>
-          <w:sz w:val="24"/>
-        </w:rPr>
-        <w:t>Dimension Coverage Matrix</w:t>
-      </w:r>
-    </w:p>
-    <w:p>
-      <w:pPr>
-        <w:jc w:val="both"/>
-        <w:spacing w:line="480" w:lineRule="auto" w:after="0"/>
-      </w:pPr>
-      <w:r>
-        <w:rPr>
-          <w:rFonts w:ascii="Times New Roman" w:hAnsi="Times New Roman" w:cs="Times New Roman"/>
-          <w:rFonts w:ascii="Times New Roman" w:hAnsi="Times New Roman"/>
-          <w:b/>
-          <w:sz w:val="24"/>
-        </w:rPr>
         <w:t>Scope and Limitation of the Study</w:t>
       </w:r>
     </w:p>
@@ -2802,21 +909,6 @@
       </w:r>
     </w:p>
     <w:p>
-      <w:pPr>
-        <w:jc w:val="both"/>
-        <w:spacing w:line="480" w:lineRule="auto" w:after="0"/>
-      </w:pPr>
-      <w:r>
-        <w:rPr>
-          <w:rFonts w:ascii="Times New Roman" w:hAnsi="Times New Roman" w:cs="Times New Roman"/>
-          <w:rFonts w:ascii="Times New Roman" w:hAnsi="Times New Roman"/>
-          <w:b/>
-          <w:sz w:val="24"/>
-        </w:rPr>
-        <w:t>Compliance verification</w:t>
-      </w:r>
-    </w:p>
-    <w:p>
       <w:r>
         <w:br w:type="page"/>
       </w:r>
@@ -2926,131 +1018,6 @@
           <w:b/>
           <w:sz w:val="24"/>
         </w:rPr>
-        <w:t>References Used (Draft Entries for CC-01 Compilation)</w:t>
-      </w:r>
-    </w:p>
-    <w:p>
-      <w:pPr>
-        <w:jc w:val="both"/>
-        <w:spacing w:line="480" w:lineRule="auto" w:after="0"/>
-        <w:ind w:firstLine="285750"/>
-      </w:pPr>
-      <w:r>
-        <w:rPr>
-          <w:rFonts w:ascii="Times New Roman" w:hAnsi="Times New Roman" w:cs="Times New Roman"/>
-          <w:rFonts w:ascii="Times New Roman" w:hAnsi="Times New Roman"/>
-          <w:b w:val="0"/>
-          <w:sz w:val="24"/>
-        </w:rPr>
-        <w:t>Addla, N. (2026). AI-Driven Development Lifecycle (AI-DLC): Reimagining software engineering for the AI era. International Journal of Artificial Intelligence, Data Science, and Machine Learning, 7(1), 266–270. https://doi.org/10.63282/3050-9262.IJAIDSML-V7I1P145</w:t>
-      </w:r>
-    </w:p>
-    <w:p>
-      <w:pPr>
-        <w:jc w:val="both"/>
-        <w:spacing w:line="480" w:lineRule="auto" w:after="0"/>
-        <w:ind w:firstLine="285750"/>
-      </w:pPr>
-      <w:r>
-        <w:rPr>
-          <w:rFonts w:ascii="Times New Roman" w:hAnsi="Times New Roman" w:cs="Times New Roman"/>
-          <w:rFonts w:ascii="Times New Roman" w:hAnsi="Times New Roman"/>
-          <w:b w:val="0"/>
-          <w:sz w:val="24"/>
-        </w:rPr>
-        <w:t>Frey, B. B. (Ed.). (2022). The SAGE encyclopedia of research design (2nd ed.). SAGE Publications, Inc. https://doi.org/10.4135/9781071812082</w:t>
-      </w:r>
-    </w:p>
-    <w:p>
-      <w:pPr>
-        <w:jc w:val="both"/>
-        <w:spacing w:line="480" w:lineRule="auto" w:after="0"/>
-        <w:ind w:firstLine="285750"/>
-      </w:pPr>
-      <w:r>
-        <w:rPr>
-          <w:rFonts w:ascii="Times New Roman" w:hAnsi="Times New Roman" w:cs="Times New Roman"/>
-          <w:rFonts w:ascii="Times New Roman" w:hAnsi="Times New Roman"/>
-          <w:b w:val="0"/>
-          <w:sz w:val="24"/>
-        </w:rPr>
-        <w:t>Malaya, A. R. N., Munar, E. A., &amp; Cuison, F. P. (2022). Information management system for research of Don Mariano Marcos Memorial State University–South La Union Campus. Indonesian Journal of Electrical Engineering and Computer Science, 28(3), 1668–1675. https://doi.org/10.11591/ijeecs.v28.i3.pp1668-1675</w:t>
-      </w:r>
-    </w:p>
-    <w:p>
-      <w:pPr>
-        <w:jc w:val="both"/>
-        <w:spacing w:line="480" w:lineRule="auto" w:after="0"/>
-        <w:ind w:firstLine="285750"/>
-      </w:pPr>
-      <w:r>
-        <w:rPr>
-          <w:rFonts w:ascii="Times New Roman" w:hAnsi="Times New Roman" w:cs="Times New Roman"/>
-          <w:rFonts w:ascii="Times New Roman" w:hAnsi="Times New Roman"/>
-          <w:b w:val="0"/>
-          <w:sz w:val="24"/>
-        </w:rPr>
-        <w:t>Olipas, C. N. P. (2023). The design and development of student information and violation management system (SIVMS) for a higher educational institution (Zenodo Record 8024683). https://doi.org/10.5281/zenodo.8024683</w:t>
-      </w:r>
-    </w:p>
-    <w:p>
-      <w:pPr>
-        <w:jc w:val="both"/>
-        <w:spacing w:line="480" w:lineRule="auto" w:after="0"/>
-        <w:ind w:firstLine="285750"/>
-      </w:pPr>
-      <w:r>
-        <w:rPr>
-          <w:rFonts w:ascii="Times New Roman" w:hAnsi="Times New Roman" w:cs="Times New Roman"/>
-          <w:rFonts w:ascii="Times New Roman" w:hAnsi="Times New Roman"/>
-          <w:b w:val="0"/>
-          <w:sz w:val="24"/>
-        </w:rPr>
-        <w:t>Raja, S. P. (2025, August 12). AI-driven development life cycle: Reimagining software engineering. AWS DevOps Blog. https://aws.amazon.com/blogs/devops/ai-driven-development-life-cycle/</w:t>
-      </w:r>
-    </w:p>
-    <w:p>
-      <w:pPr>
-        <w:jc w:val="both"/>
-        <w:spacing w:line="480" w:lineRule="auto" w:after="0"/>
-      </w:pPr>
-      <w:r>
-        <w:rPr>
-          <w:rFonts w:ascii="Times New Roman" w:hAnsi="Times New Roman" w:cs="Times New Roman"/>
-          <w:rFonts w:ascii="Times New Roman" w:hAnsi="Times New Roman"/>
-          <w:b/>
-          <w:sz w:val="24"/>
-        </w:rPr>
-        <w:t>Source Verification Log</w:t>
-      </w:r>
-    </w:p>
-    <w:p>
-      <w:pPr>
-        <w:jc w:val="both"/>
-        <w:spacing w:line="480" w:lineRule="auto" w:after="0"/>
-      </w:pPr>
-      <w:r>
-        <w:rPr>
-          <w:rFonts w:ascii="Times New Roman" w:hAnsi="Times New Roman" w:cs="Times New Roman"/>
-          <w:rFonts w:ascii="Times New Roman" w:hAnsi="Times New Roman"/>
-          <w:b/>
-          <w:sz w:val="24"/>
-        </w:rPr>
-        <w:t>Compliance Verification</w:t>
-      </w:r>
-    </w:p>
-    <w:p>
-      <w:pPr>
-        <w:jc w:val="both"/>
-        <w:spacing w:line="480" w:lineRule="auto" w:after="0"/>
-      </w:pPr>
-      <w:r>
-        <w:rPr>
-          <w:rFonts w:ascii="Times New Roman" w:hAnsi="Times New Roman" w:cs="Times New Roman"/>
-          <w:rFonts w:ascii="Times New Roman" w:hAnsi="Times New Roman"/>
-          <w:b/>
-          <w:sz w:val="24"/>
-        </w:rPr>
         <w:t>Software Development Model</w:t>
       </w:r>
     </w:p>
@@ -3088,146 +1055,56 @@
     </w:p>
     <w:p>
       <w:pPr>
-        <w:jc w:val="both"/>
+        <w:jc w:val="center"/>
+      </w:pPr>
+      <w:r>
+        <w:drawing>
+          <wp:inline xmlns:a="http://schemas.openxmlformats.org/drawingml/2006/main" xmlns:pic="http://schemas.openxmlformats.org/drawingml/2006/picture">
+            <wp:extent cx="5029200" cy="1207516"/>
+            <wp:docPr id="2" name="Picture 2"/>
+            <wp:cNvGraphicFramePr>
+              <a:graphicFrameLocks noChangeAspect="1"/>
+            </wp:cNvGraphicFramePr>
+            <a:graphic>
+              <a:graphicData uri="http://schemas.openxmlformats.org/drawingml/2006/picture">
+                <pic:pic>
+                  <pic:nvPicPr>
+                    <pic:cNvPr id="0" name="aidlc_phases.png"/>
+                    <pic:cNvPicPr/>
+                  </pic:nvPicPr>
+                  <pic:blipFill>
+                    <a:blip r:embed="rId15"/>
+                    <a:stretch>
+                      <a:fillRect/>
+                    </a:stretch>
+                  </pic:blipFill>
+                  <pic:spPr>
+                    <a:xfrm>
+                      <a:off x="0" y="0"/>
+                      <a:ext cx="5029200" cy="1207516"/>
+                    </a:xfrm>
+                    <a:prstGeom prst="rect"/>
+                  </pic:spPr>
+                </pic:pic>
+              </a:graphicData>
+            </a:graphic>
+          </wp:inline>
+        </w:drawing>
+      </w:r>
+    </w:p>
+    <w:p>
+      <w:pPr>
+        <w:jc w:val="center"/>
         <w:spacing w:line="480" w:lineRule="auto" w:after="0"/>
-        <w:ind w:firstLine="285750"/>
       </w:pPr>
       <w:r>
         <w:rPr>
           <w:rFonts w:ascii="Times New Roman" w:hAnsi="Times New Roman" w:cs="Times New Roman"/>
           <w:rFonts w:ascii="Times New Roman" w:hAnsi="Times New Roman"/>
-          <w:b w:val="0"/>
+          <w:b/>
           <w:sz w:val="24"/>
         </w:rPr>
-        <w:t>┌─────────────────────────┐     ┌─────────────────────────┐     ┌─────────────────────────┐</w:t>
-      </w:r>
-    </w:p>
-    <w:p>
-      <w:pPr>
-        <w:jc w:val="both"/>
-        <w:spacing w:line="480" w:lineRule="auto" w:after="0"/>
-        <w:ind w:firstLine="285750"/>
-      </w:pPr>
-      <w:r>
-        <w:rPr>
-          <w:rFonts w:ascii="Times New Roman" w:hAnsi="Times New Roman" w:cs="Times New Roman"/>
-          <w:rFonts w:ascii="Times New Roman" w:hAnsi="Times New Roman"/>
-          <w:b w:val="0"/>
-          <w:sz w:val="24"/>
-        </w:rPr>
-        <w:t>│        INCEPTION        │     │      CONSTRUCTION       │     │       OPERATIONS        │</w:t>
-      </w:r>
-    </w:p>
-    <w:p>
-      <w:pPr>
-        <w:jc w:val="both"/>
-        <w:spacing w:line="480" w:lineRule="auto" w:after="0"/>
-        <w:ind w:firstLine="285750"/>
-      </w:pPr>
-      <w:r>
-        <w:rPr>
-          <w:rFonts w:ascii="Times New Roman" w:hAnsi="Times New Roman" w:cs="Times New Roman"/>
-          <w:rFonts w:ascii="Times New Roman" w:hAnsi="Times New Roman"/>
-          <w:b w:val="0"/>
-          <w:sz w:val="24"/>
-        </w:rPr>
-        <w:t>├─────────────────────────┤     ├─────────────────────────┤     ├─────────────────────────┤</w:t>
-      </w:r>
-    </w:p>
-    <w:p>
-      <w:pPr>
-        <w:jc w:val="both"/>
-        <w:spacing w:line="480" w:lineRule="auto" w:after="0"/>
-        <w:ind w:firstLine="285750"/>
-      </w:pPr>
-      <w:r>
-        <w:rPr>
-          <w:rFonts w:ascii="Times New Roman" w:hAnsi="Times New Roman" w:cs="Times New Roman"/>
-          <w:rFonts w:ascii="Times New Roman" w:hAnsi="Times New Roman"/>
-          <w:b w:val="0"/>
-          <w:sz w:val="24"/>
-        </w:rPr>
-        <w:t>│ • Mob Elaboration       │     │ • Mob Construction      │     │ • Pilot Deployment      │</w:t>
-      </w:r>
-    </w:p>
-    <w:p>
-      <w:pPr>
-        <w:jc w:val="both"/>
-        <w:spacing w:line="480" w:lineRule="auto" w:after="0"/>
-        <w:ind w:firstLine="285750"/>
-      </w:pPr>
-      <w:r>
-        <w:rPr>
-          <w:rFonts w:ascii="Times New Roman" w:hAnsi="Times New Roman" w:cs="Times New Roman"/>
-          <w:rFonts w:ascii="Times New Roman" w:hAnsi="Times New Roman"/>
-          <w:b w:val="0"/>
-          <w:sz w:val="24"/>
-        </w:rPr>
-        <w:t>│ • Requirements Trans.  │     │ • AI-assisted Coding    │     │ • AI-assisted Monitor   │</w:t>
-      </w:r>
-    </w:p>
-    <w:p>
-      <w:pPr>
-        <w:jc w:val="both"/>
-        <w:spacing w:line="480" w:lineRule="auto" w:after="0"/>
-        <w:ind w:firstLine="285750"/>
-      </w:pPr>
-      <w:r>
-        <w:rPr>
-          <w:rFonts w:ascii="Times New Roman" w:hAnsi="Times New Roman" w:cs="Times New Roman"/>
-          <w:rFonts w:ascii="Times New Roman" w:hAnsi="Times New Roman"/>
-          <w:b w:val="0"/>
-          <w:sz w:val="24"/>
-        </w:rPr>
-        <w:t>│ • Schema &amp; Architecture │ ──&gt; │ • Automated Unit Tests  │ ──&gt; │ • Audit Verification    │</w:t>
-      </w:r>
-    </w:p>
-    <w:p>
-      <w:pPr>
-        <w:jc w:val="both"/>
-        <w:spacing w:line="480" w:lineRule="auto" w:after="0"/>
-        <w:ind w:firstLine="285750"/>
-      </w:pPr>
-      <w:r>
-        <w:rPr>
-          <w:rFonts w:ascii="Times New Roman" w:hAnsi="Times New Roman" w:cs="Times New Roman"/>
-          <w:rFonts w:ascii="Times New Roman" w:hAnsi="Times New Roman"/>
-          <w:b w:val="0"/>
-          <w:sz w:val="24"/>
-        </w:rPr>
-        <w:t>│ • AI-Agent Guidance     │     │ • Human Review &amp; QA     │     │ • SUS &amp; TLX Evaluation  │</w:t>
-      </w:r>
-    </w:p>
-    <w:p>
-      <w:pPr>
-        <w:jc w:val="both"/>
-        <w:spacing w:line="480" w:lineRule="auto" w:after="0"/>
-        <w:ind w:firstLine="285750"/>
-      </w:pPr>
-      <w:r>
-        <w:rPr>
-          <w:rFonts w:ascii="Times New Roman" w:hAnsi="Times New Roman" w:cs="Times New Roman"/>
-          <w:rFonts w:ascii="Times New Roman" w:hAnsi="Times New Roman"/>
-          <w:b w:val="0"/>
-          <w:sz w:val="24"/>
-        </w:rPr>
-        <w:t>│                         │     │ • Rapid Prototyping     │     │                         │</w:t>
-      </w:r>
-    </w:p>
-    <w:p>
-      <w:pPr>
-        <w:jc w:val="both"/>
-        <w:spacing w:line="480" w:lineRule="auto" w:after="0"/>
-        <w:ind w:firstLine="285750"/>
-      </w:pPr>
-      <w:r>
-        <w:rPr>
-          <w:rFonts w:ascii="Times New Roman" w:hAnsi="Times New Roman" w:cs="Times New Roman"/>
-          <w:rFonts w:ascii="Times New Roman" w:hAnsi="Times New Roman"/>
-          <w:b w:val="0"/>
-          <w:sz w:val="24"/>
-        </w:rPr>
-        <w:t>└─────────────────────────┘     └─────────────────────────┘     └─────────────────────────┘</w:t>
+        <w:t>Figure 2. AI-Driven Development Lifecycle (AIDLC) Phases of SecureCAT: A Role-Based College Admission Testing System for the Guidance and Registrar Offices at ISPSC Tagudin</w:t>
       </w:r>
     </w:p>
     <w:p>
@@ -3290,44 +1167,51 @@
           <w:b/>
           <w:sz w:val="24"/>
         </w:rPr>
-        <w:t>References used (Draft entries for CC-01 compilation)</w:t>
-      </w:r>
-    </w:p>
-    <w:p>
-      <w:pPr>
-        <w:jc w:val="both"/>
-        <w:spacing w:line="480" w:lineRule="auto" w:after="0"/>
-        <w:ind w:firstLine="285750"/>
-      </w:pPr>
-      <w:r>
-        <w:rPr>
-          <w:rFonts w:ascii="Times New Roman" w:hAnsi="Times New Roman" w:cs="Times New Roman"/>
-          <w:rFonts w:ascii="Times New Roman" w:hAnsi="Times New Roman"/>
-          <w:b w:val="0"/>
-          <w:sz w:val="24"/>
-        </w:rPr>
-        <w:t>Addla, N. (2026). AI-Driven Development Lifecycle (AI-DLC): Reimagining software engineering for the AI era. International Journal of Artificial Intelligence, Data Science, and Machine Learning, 7(1), 266–270. https://doi.org/10.63282/3050-9262.IJAIDSML-V7I1P145</w:t>
-      </w:r>
-    </w:p>
-    <w:p>
-      <w:pPr>
-        <w:jc w:val="both"/>
-        <w:spacing w:line="480" w:lineRule="auto" w:after="0"/>
-        <w:ind w:firstLine="285750"/>
-      </w:pPr>
-      <w:r>
-        <w:rPr>
-          <w:rFonts w:ascii="Times New Roman" w:hAnsi="Times New Roman" w:cs="Times New Roman"/>
-          <w:rFonts w:ascii="Times New Roman" w:hAnsi="Times New Roman"/>
-          <w:b w:val="0"/>
-          <w:sz w:val="24"/>
-        </w:rPr>
-        <w:t>Raja, S. P. (2025, August 12). AI-driven development life cycle: Reimagining software engineering. AWS DevOps Blog. https://aws.amazon.com/blogs/devops/ai-driven-development-life-cycle/</w:t>
-      </w:r>
-    </w:p>
-    <w:p>
-      <w:pPr>
-        <w:jc w:val="both"/>
+        <w:t>Project Plan</w:t>
+      </w:r>
+    </w:p>
+    <w:p>
+      <w:pPr>
+        <w:jc w:val="center"/>
+      </w:pPr>
+      <w:r>
+        <w:drawing>
+          <wp:inline xmlns:a="http://schemas.openxmlformats.org/drawingml/2006/main" xmlns:pic="http://schemas.openxmlformats.org/drawingml/2006/picture">
+            <wp:extent cx="5029200" cy="2499895"/>
+            <wp:docPr id="3" name="Picture 3"/>
+            <wp:cNvGraphicFramePr>
+              <a:graphicFrameLocks noChangeAspect="1"/>
+            </wp:cNvGraphicFramePr>
+            <a:graphic>
+              <a:graphicData uri="http://schemas.openxmlformats.org/drawingml/2006/picture">
+                <pic:pic>
+                  <pic:nvPicPr>
+                    <pic:cNvPr id="0" name="gantt_chart.png"/>
+                    <pic:cNvPicPr/>
+                  </pic:nvPicPr>
+                  <pic:blipFill>
+                    <a:blip r:embed="rId16"/>
+                    <a:stretch>
+                      <a:fillRect/>
+                    </a:stretch>
+                  </pic:blipFill>
+                  <pic:spPr>
+                    <a:xfrm>
+                      <a:off x="0" y="0"/>
+                      <a:ext cx="5029200" cy="2499895"/>
+                    </a:xfrm>
+                    <a:prstGeom prst="rect"/>
+                  </pic:spPr>
+                </pic:pic>
+              </a:graphicData>
+            </a:graphic>
+          </wp:inline>
+        </w:drawing>
+      </w:r>
+    </w:p>
+    <w:p>
+      <w:pPr>
+        <w:jc w:val="center"/>
         <w:spacing w:line="480" w:lineRule="auto" w:after="0"/>
       </w:pPr>
       <w:r>
@@ -3337,709 +1221,7 @@
           <w:b/>
           <w:sz w:val="24"/>
         </w:rPr>
-        <w:t>Source verification log</w:t>
-      </w:r>
-    </w:p>
-    <w:p>
-      <w:pPr>
-        <w:jc w:val="both"/>
-        <w:spacing w:line="480" w:lineRule="auto" w:after="0"/>
-      </w:pPr>
-      <w:r>
-        <w:rPr>
-          <w:rFonts w:ascii="Times New Roman" w:hAnsi="Times New Roman" w:cs="Times New Roman"/>
-          <w:rFonts w:ascii="Times New Roman" w:hAnsi="Times New Roman"/>
-          <w:b/>
-          <w:sz w:val="24"/>
-        </w:rPr>
-        <w:t>Compliance verification</w:t>
-      </w:r>
-    </w:p>
-    <w:p>
-      <w:pPr>
-        <w:jc w:val="both"/>
-        <w:spacing w:line="480" w:lineRule="auto" w:after="0"/>
-      </w:pPr>
-      <w:r>
-        <w:rPr>
-          <w:rFonts w:ascii="Times New Roman" w:hAnsi="Times New Roman" w:cs="Times New Roman"/>
-          <w:rFonts w:ascii="Times New Roman" w:hAnsi="Times New Roman"/>
-          <w:b/>
-          <w:sz w:val="24"/>
-        </w:rPr>
-        <w:t>Project Plan</w:t>
-      </w:r>
-    </w:p>
-    <w:p>
-      <w:pPr>
-        <w:jc w:val="both"/>
-        <w:spacing w:line="480" w:lineRule="auto" w:after="0"/>
-        <w:ind w:firstLine="285750"/>
-      </w:pPr>
-      <w:r>
-        <w:rPr>
-          <w:rFonts w:ascii="Times New Roman" w:hAnsi="Times New Roman" w:cs="Times New Roman"/>
-          <w:rFonts w:ascii="Times New Roman" w:hAnsi="Times New Roman"/>
-          <w:b w:val="0"/>
-          <w:sz w:val="24"/>
-        </w:rPr>
-        <w:t>```</w:t>
-      </w:r>
-    </w:p>
-    <w:p>
-      <w:pPr>
-        <w:jc w:val="both"/>
-        <w:spacing w:line="480" w:lineRule="auto" w:after="0"/>
-        <w:ind w:firstLine="285750"/>
-      </w:pPr>
-      <w:r>
-        <w:rPr>
-          <w:rFonts w:ascii="Times New Roman" w:hAnsi="Times New Roman" w:cs="Times New Roman"/>
-          <w:rFonts w:ascii="Times New Roman" w:hAnsi="Times New Roman"/>
-          <w:b w:val="0"/>
-          <w:sz w:val="24"/>
-        </w:rPr>
-        <w:t>PROJECT GANTT CHART — SecureCAT-v2 (2026)</w:t>
-      </w:r>
-    </w:p>
-    <w:p>
-      <w:pPr>
-        <w:jc w:val="both"/>
-        <w:spacing w:line="480" w:lineRule="auto" w:after="0"/>
-        <w:ind w:firstLine="285750"/>
-      </w:pPr>
-      <w:r>
-        <w:rPr>
-          <w:rFonts w:ascii="Times New Roman" w:hAnsi="Times New Roman" w:cs="Times New Roman"/>
-          <w:rFonts w:ascii="Times New Roman" w:hAnsi="Times New Roman"/>
-          <w:b w:val="0"/>
-          <w:sz w:val="24"/>
-        </w:rPr>
-        <w:t>May 2026              June 2026             July 2026           August 2026</w:t>
-      </w:r>
-    </w:p>
-    <w:p>
-      <w:pPr>
-        <w:jc w:val="both"/>
-        <w:spacing w:line="480" w:lineRule="auto" w:after="0"/>
-        <w:ind w:firstLine="285750"/>
-      </w:pPr>
-      <w:r>
-        <w:rPr>
-          <w:rFonts w:ascii="Times New Roman" w:hAnsi="Times New Roman" w:cs="Times New Roman"/>
-          <w:rFonts w:ascii="Times New Roman" w:hAnsi="Times New Roman"/>
-          <w:b w:val="0"/>
-          <w:sz w:val="24"/>
-        </w:rPr>
-        <w:t>W1  W2  W3  W4       W1  W2  W3  W4       W1  W2  W3  W4       W1  W2  W3</w:t>
-      </w:r>
-    </w:p>
-    <w:p>
-      <w:pPr>
-        <w:jc w:val="both"/>
-        <w:spacing w:line="480" w:lineRule="auto" w:after="0"/>
-        <w:ind w:firstLine="285750"/>
-      </w:pPr>
-      <w:r>
-        <w:rPr>
-          <w:rFonts w:ascii="Times New Roman" w:hAnsi="Times New Roman" w:cs="Times New Roman"/>
-          <w:rFonts w:ascii="Times New Roman" w:hAnsi="Times New Roman"/>
-          <w:b w:val="0"/>
-          <w:sz w:val="24"/>
-        </w:rPr>
-        <w:t>─── ─── ─── ───      ─── ─── ─── ───      ─── ─── ─── ───      ─── ─── ───</w:t>
-      </w:r>
-    </w:p>
-    <w:p>
-      <w:pPr>
-        <w:jc w:val="both"/>
-        <w:spacing w:line="480" w:lineRule="auto" w:after="0"/>
-        <w:ind w:firstLine="285750"/>
-      </w:pPr>
-      <w:r>
-        <w:rPr>
-          <w:rFonts w:ascii="Times New Roman" w:hAnsi="Times New Roman" w:cs="Times New Roman"/>
-          <w:rFonts w:ascii="Times New Roman" w:hAnsi="Times New Roman"/>
-          <w:b w:val="0"/>
-          <w:sz w:val="24"/>
-        </w:rPr>
-        <w:t>AIDLC   ████████████████████  ████████████████      ────────────────      ───────────</w:t>
-      </w:r>
-    </w:p>
-    <w:p>
-      <w:pPr>
-        <w:jc w:val="both"/>
-        <w:spacing w:line="480" w:lineRule="auto" w:after="0"/>
-        <w:ind w:firstLine="285750"/>
-      </w:pPr>
-      <w:r>
-        <w:rPr>
-          <w:rFonts w:ascii="Times New Roman" w:hAnsi="Times New Roman" w:cs="Times New Roman"/>
-          <w:rFonts w:ascii="Times New Roman" w:hAnsi="Times New Roman"/>
-          <w:b w:val="0"/>
-          <w:sz w:val="24"/>
-        </w:rPr>
-        <w:t>PHASES</w:t>
-      </w:r>
-    </w:p>
-    <w:p>
-      <w:pPr>
-        <w:jc w:val="both"/>
-        <w:spacing w:line="480" w:lineRule="auto" w:after="0"/>
-        <w:ind w:firstLine="285750"/>
-      </w:pPr>
-      <w:r>
-        <w:rPr>
-          <w:rFonts w:ascii="Times New Roman" w:hAnsi="Times New Roman" w:cs="Times New Roman"/>
-          <w:rFonts w:ascii="Times New Roman" w:hAnsi="Times New Roman"/>
-          <w:b w:val="0"/>
-          <w:sz w:val="24"/>
-        </w:rPr>
-        <w:t>─── ─── ─── ───      ─── ─── ─── ───      ─── ─── ─── ───      ─── ─── ───</w:t>
-      </w:r>
-    </w:p>
-    <w:p>
-      <w:pPr>
-        <w:jc w:val="both"/>
-        <w:spacing w:line="480" w:lineRule="auto" w:after="0"/>
-        <w:ind w:firstLine="285750"/>
-      </w:pPr>
-      <w:r>
-        <w:rPr>
-          <w:rFonts w:ascii="Times New Roman" w:hAnsi="Times New Roman" w:cs="Times New Roman"/>
-          <w:rFonts w:ascii="Times New Roman" w:hAnsi="Times New Roman"/>
-          <w:b w:val="0"/>
-          <w:sz w:val="24"/>
-        </w:rPr>
-        <w:t>INCEPTION</w:t>
-      </w:r>
-    </w:p>
-    <w:p>
-      <w:pPr>
-        <w:jc w:val="both"/>
-        <w:spacing w:line="480" w:lineRule="auto" w:after="0"/>
-        <w:ind w:firstLine="285750"/>
-      </w:pPr>
-      <w:r>
-        <w:rPr>
-          <w:rFonts w:ascii="Times New Roman" w:hAnsi="Times New Roman" w:cs="Times New Roman"/>
-          <w:rFonts w:ascii="Times New Roman" w:hAnsi="Times New Roman"/>
-          <w:b w:val="0"/>
-          <w:sz w:val="24"/>
-        </w:rPr>
-        <w:t>Interviews &amp;              ──────────────</w:t>
-      </w:r>
-    </w:p>
-    <w:p>
-      <w:pPr>
-        <w:jc w:val="both"/>
-        <w:spacing w:line="480" w:lineRule="auto" w:after="0"/>
-        <w:ind w:firstLine="285750"/>
-      </w:pPr>
-      <w:r>
-        <w:rPr>
-          <w:rFonts w:ascii="Times New Roman" w:hAnsi="Times New Roman" w:cs="Times New Roman"/>
-          <w:rFonts w:ascii="Times New Roman" w:hAnsi="Times New Roman"/>
-          <w:b w:val="0"/>
-          <w:sz w:val="24"/>
-        </w:rPr>
-        <w:t>Data Gathering    ███ ███  ███ ────────────────────────────────────────────────────</w:t>
-      </w:r>
-    </w:p>
-    <w:p>
-      <w:pPr>
-        <w:jc w:val="both"/>
-        <w:spacing w:line="480" w:lineRule="auto" w:after="0"/>
-        <w:ind w:firstLine="285750"/>
-      </w:pPr>
-      <w:r>
-        <w:rPr>
-          <w:rFonts w:ascii="Times New Roman" w:hAnsi="Times New Roman" w:cs="Times New Roman"/>
-          <w:rFonts w:ascii="Times New Roman" w:hAnsi="Times New Roman"/>
-          <w:b w:val="0"/>
-          <w:sz w:val="24"/>
-        </w:rPr>
-        <w:t>Requirements              ──────</w:t>
-      </w:r>
-    </w:p>
-    <w:p>
-      <w:pPr>
-        <w:jc w:val="both"/>
-        <w:spacing w:line="480" w:lineRule="auto" w:after="0"/>
-        <w:ind w:firstLine="285750"/>
-      </w:pPr>
-      <w:r>
-        <w:rPr>
-          <w:rFonts w:ascii="Times New Roman" w:hAnsi="Times New Roman" w:cs="Times New Roman"/>
-          <w:rFonts w:ascii="Times New Roman" w:hAnsi="Times New Roman"/>
-          <w:b w:val="0"/>
-          <w:sz w:val="24"/>
-        </w:rPr>
-        <w:t>Analysis          ─── ███  ███ ███  ──────────────────────────────────────────────</w:t>
-      </w:r>
-    </w:p>
-    <w:p>
-      <w:pPr>
-        <w:jc w:val="both"/>
-        <w:spacing w:line="480" w:lineRule="auto" w:after="0"/>
-        <w:ind w:firstLine="285750"/>
-      </w:pPr>
-      <w:r>
-        <w:rPr>
-          <w:rFonts w:ascii="Times New Roman" w:hAnsi="Times New Roman" w:cs="Times New Roman"/>
-          <w:rFonts w:ascii="Times New Roman" w:hAnsi="Times New Roman"/>
-          <w:b w:val="0"/>
-          <w:sz w:val="24"/>
-        </w:rPr>
-        <w:t>Architecture &amp;            ────────────</w:t>
-      </w:r>
-    </w:p>
-    <w:p>
-      <w:pPr>
-        <w:jc w:val="both"/>
-        <w:spacing w:line="480" w:lineRule="auto" w:after="0"/>
-        <w:ind w:firstLine="285750"/>
-      </w:pPr>
-      <w:r>
-        <w:rPr>
-          <w:rFonts w:ascii="Times New Roman" w:hAnsi="Times New Roman" w:cs="Times New Roman"/>
-          <w:rFonts w:ascii="Times New Roman" w:hAnsi="Times New Roman"/>
-          <w:b w:val="0"/>
-          <w:sz w:val="24"/>
-        </w:rPr>
-        <w:t>Design            ─── ───  ─── ███  ███  ─────────────────────────────────────────</w:t>
-      </w:r>
-    </w:p>
-    <w:p>
-      <w:pPr>
-        <w:jc w:val="both"/>
-        <w:spacing w:line="480" w:lineRule="auto" w:after="0"/>
-        <w:ind w:firstLine="285750"/>
-      </w:pPr>
-      <w:r>
-        <w:rPr>
-          <w:rFonts w:ascii="Times New Roman" w:hAnsi="Times New Roman" w:cs="Times New Roman"/>
-          <w:rFonts w:ascii="Times New Roman" w:hAnsi="Times New Roman"/>
-          <w:b w:val="0"/>
-          <w:sz w:val="24"/>
-        </w:rPr>
-        <w:t>─── ─── ─── ───      ─── ─── ─── ───      ─── ─── ─── ───      ─── ─── ───</w:t>
-      </w:r>
-    </w:p>
-    <w:p>
-      <w:pPr>
-        <w:jc w:val="both"/>
-        <w:spacing w:line="480" w:lineRule="auto" w:after="0"/>
-        <w:ind w:firstLine="285750"/>
-      </w:pPr>
-      <w:r>
-        <w:rPr>
-          <w:rFonts w:ascii="Times New Roman" w:hAnsi="Times New Roman" w:cs="Times New Roman"/>
-          <w:rFonts w:ascii="Times New Roman" w:hAnsi="Times New Roman"/>
-          <w:b w:val="0"/>
-          <w:sz w:val="24"/>
-        </w:rPr>
-        <w:t>CONSTRUCTION</w:t>
-      </w:r>
-    </w:p>
-    <w:p>
-      <w:pPr>
-        <w:jc w:val="both"/>
-        <w:spacing w:line="480" w:lineRule="auto" w:after="0"/>
-        <w:ind w:firstLine="285750"/>
-      </w:pPr>
-      <w:r>
-        <w:rPr>
-          <w:rFonts w:ascii="Times New Roman" w:hAnsi="Times New Roman" w:cs="Times New Roman"/>
-          <w:rFonts w:ascii="Times New Roman" w:hAnsi="Times New Roman"/>
-          <w:b w:val="0"/>
-          <w:sz w:val="24"/>
-        </w:rPr>
-        <w:t>Backend                                ──────────────</w:t>
-      </w:r>
-    </w:p>
-    <w:p>
-      <w:pPr>
-        <w:jc w:val="both"/>
-        <w:spacing w:line="480" w:lineRule="auto" w:after="0"/>
-        <w:ind w:firstLine="285750"/>
-      </w:pPr>
-      <w:r>
-        <w:rPr>
-          <w:rFonts w:ascii="Times New Roman" w:hAnsi="Times New Roman" w:cs="Times New Roman"/>
-          <w:rFonts w:ascii="Times New Roman" w:hAnsi="Times New Roman"/>
-          <w:b w:val="0"/>
-          <w:sz w:val="24"/>
-        </w:rPr>
-        <w:t>Development       ──────────────────── ███ ███ ███  ─────────────────────────────</w:t>
-      </w:r>
-    </w:p>
-    <w:p>
-      <w:pPr>
-        <w:jc w:val="both"/>
-        <w:spacing w:line="480" w:lineRule="auto" w:after="0"/>
-        <w:ind w:firstLine="285750"/>
-      </w:pPr>
-      <w:r>
-        <w:rPr>
-          <w:rFonts w:ascii="Times New Roman" w:hAnsi="Times New Roman" w:cs="Times New Roman"/>
-          <w:rFonts w:ascii="Times New Roman" w:hAnsi="Times New Roman"/>
-          <w:b w:val="0"/>
-          <w:sz w:val="24"/>
-        </w:rPr>
-        <w:t>Frontend                                       ──────</w:t>
-      </w:r>
-    </w:p>
-    <w:p>
-      <w:pPr>
-        <w:jc w:val="both"/>
-        <w:spacing w:line="480" w:lineRule="auto" w:after="0"/>
-        <w:ind w:firstLine="285750"/>
-      </w:pPr>
-      <w:r>
-        <w:rPr>
-          <w:rFonts w:ascii="Times New Roman" w:hAnsi="Times New Roman" w:cs="Times New Roman"/>
-          <w:rFonts w:ascii="Times New Roman" w:hAnsi="Times New Roman"/>
-          <w:b w:val="0"/>
-          <w:sz w:val="24"/>
-        </w:rPr>
-        <w:t>Development       ──────────────────── ─── ███ ███ ███  ─────────────────────────</w:t>
-      </w:r>
-    </w:p>
-    <w:p>
-      <w:pPr>
-        <w:jc w:val="both"/>
-        <w:spacing w:line="480" w:lineRule="auto" w:after="0"/>
-        <w:ind w:firstLine="285750"/>
-      </w:pPr>
-      <w:r>
-        <w:rPr>
-          <w:rFonts w:ascii="Times New Roman" w:hAnsi="Times New Roman" w:cs="Times New Roman"/>
-          <w:rFonts w:ascii="Times New Roman" w:hAnsi="Times New Roman"/>
-          <w:b w:val="0"/>
-          <w:sz w:val="24"/>
-        </w:rPr>
-        <w:t>Automated &amp;</w:t>
-      </w:r>
-    </w:p>
-    <w:p>
-      <w:pPr>
-        <w:jc w:val="both"/>
-        <w:spacing w:line="480" w:lineRule="auto" w:after="0"/>
-        <w:ind w:firstLine="285750"/>
-      </w:pPr>
-      <w:r>
-        <w:rPr>
-          <w:rFonts w:ascii="Times New Roman" w:hAnsi="Times New Roman" w:cs="Times New Roman"/>
-          <w:rFonts w:ascii="Times New Roman" w:hAnsi="Times New Roman"/>
-          <w:b w:val="0"/>
-          <w:sz w:val="24"/>
-        </w:rPr>
-        <w:t>Unit Testing      ──────────────────── ─── ─── ─── ███ ███ ███  ────────────────</w:t>
-      </w:r>
-    </w:p>
-    <w:p>
-      <w:pPr>
-        <w:jc w:val="both"/>
-        <w:spacing w:line="480" w:lineRule="auto" w:after="0"/>
-        <w:ind w:firstLine="285750"/>
-      </w:pPr>
-      <w:r>
-        <w:rPr>
-          <w:rFonts w:ascii="Times New Roman" w:hAnsi="Times New Roman" w:cs="Times New Roman"/>
-          <w:rFonts w:ascii="Times New Roman" w:hAnsi="Times New Roman"/>
-          <w:b w:val="0"/>
-          <w:sz w:val="24"/>
-        </w:rPr>
-        <w:t>Integration &amp;</w:t>
-      </w:r>
-    </w:p>
-    <w:p>
-      <w:pPr>
-        <w:jc w:val="both"/>
-        <w:spacing w:line="480" w:lineRule="auto" w:after="0"/>
-        <w:ind w:firstLine="285750"/>
-      </w:pPr>
-      <w:r>
-        <w:rPr>
-          <w:rFonts w:ascii="Times New Roman" w:hAnsi="Times New Roman" w:cs="Times New Roman"/>
-          <w:rFonts w:ascii="Times New Roman" w:hAnsi="Times New Roman"/>
-          <w:b w:val="0"/>
-          <w:sz w:val="24"/>
-        </w:rPr>
-        <w:t>Security QA       ──────────────────── ─── ─── ─── ─── ███ ███ ███  ────────────</w:t>
-      </w:r>
-    </w:p>
-    <w:p>
-      <w:pPr>
-        <w:jc w:val="both"/>
-        <w:spacing w:line="480" w:lineRule="auto" w:after="0"/>
-        <w:ind w:firstLine="285750"/>
-      </w:pPr>
-      <w:r>
-        <w:rPr>
-          <w:rFonts w:ascii="Times New Roman" w:hAnsi="Times New Roman" w:cs="Times New Roman"/>
-          <w:rFonts w:ascii="Times New Roman" w:hAnsi="Times New Roman"/>
-          <w:b w:val="0"/>
-          <w:sz w:val="24"/>
-        </w:rPr>
-        <w:t>─── ─── ─── ───      ─── ─── ─── ───      ─── ─── ─── ───      ─── ─── ───</w:t>
-      </w:r>
-    </w:p>
-    <w:p>
-      <w:pPr>
-        <w:jc w:val="both"/>
-        <w:spacing w:line="480" w:lineRule="auto" w:after="0"/>
-        <w:ind w:firstLine="285750"/>
-      </w:pPr>
-      <w:r>
-        <w:rPr>
-          <w:rFonts w:ascii="Times New Roman" w:hAnsi="Times New Roman" w:cs="Times New Roman"/>
-          <w:rFonts w:ascii="Times New Roman" w:hAnsi="Times New Roman"/>
-          <w:b w:val="0"/>
-          <w:sz w:val="24"/>
-        </w:rPr>
-        <w:t>OPERATIONS</w:t>
-      </w:r>
-    </w:p>
-    <w:p>
-      <w:pPr>
-        <w:jc w:val="both"/>
-        <w:spacing w:line="480" w:lineRule="auto" w:after="0"/>
-        <w:ind w:firstLine="285750"/>
-      </w:pPr>
-      <w:r>
-        <w:rPr>
-          <w:rFonts w:ascii="Times New Roman" w:hAnsi="Times New Roman" w:cs="Times New Roman"/>
-          <w:rFonts w:ascii="Times New Roman" w:hAnsi="Times New Roman"/>
-          <w:b w:val="0"/>
-          <w:sz w:val="24"/>
-        </w:rPr>
-        <w:t>Pilot                                    ────────────────────</w:t>
-      </w:r>
-    </w:p>
-    <w:p>
-      <w:pPr>
-        <w:jc w:val="both"/>
-        <w:spacing w:line="480" w:lineRule="auto" w:after="0"/>
-        <w:ind w:firstLine="285750"/>
-      </w:pPr>
-      <w:r>
-        <w:rPr>
-          <w:rFonts w:ascii="Times New Roman" w:hAnsi="Times New Roman" w:cs="Times New Roman"/>
-          <w:rFonts w:ascii="Times New Roman" w:hAnsi="Times New Roman"/>
-          <w:b w:val="0"/>
-          <w:sz w:val="24"/>
-        </w:rPr>
-        <w:t>Deployment        ──────────────────────────── ███ ███ ███  ─────────────────────</w:t>
-      </w:r>
-    </w:p>
-    <w:p>
-      <w:pPr>
-        <w:jc w:val="both"/>
-        <w:spacing w:line="480" w:lineRule="auto" w:after="0"/>
-        <w:ind w:firstLine="285750"/>
-      </w:pPr>
-      <w:r>
-        <w:rPr>
-          <w:rFonts w:ascii="Times New Roman" w:hAnsi="Times New Roman" w:cs="Times New Roman"/>
-          <w:rFonts w:ascii="Times New Roman" w:hAnsi="Times New Roman"/>
-          <w:b w:val="0"/>
-          <w:sz w:val="24"/>
-        </w:rPr>
-        <w:t>SUS &amp; NASA-TLX                                     ────────────────</w:t>
-      </w:r>
-    </w:p>
-    <w:p>
-      <w:pPr>
-        <w:jc w:val="both"/>
-        <w:spacing w:line="480" w:lineRule="auto" w:after="0"/>
-        <w:ind w:firstLine="285750"/>
-      </w:pPr>
-      <w:r>
-        <w:rPr>
-          <w:rFonts w:ascii="Times New Roman" w:hAnsi="Times New Roman" w:cs="Times New Roman"/>
-          <w:rFonts w:ascii="Times New Roman" w:hAnsi="Times New Roman"/>
-          <w:b w:val="0"/>
-          <w:sz w:val="24"/>
-        </w:rPr>
-        <w:t>Evaluation        ──────────────────────────── ─── ─── ███ ███ ███  ─────────────</w:t>
-      </w:r>
-    </w:p>
-    <w:p>
-      <w:pPr>
-        <w:jc w:val="both"/>
-        <w:spacing w:line="480" w:lineRule="auto" w:after="0"/>
-        <w:ind w:firstLine="285750"/>
-      </w:pPr>
-      <w:r>
-        <w:rPr>
-          <w:rFonts w:ascii="Times New Roman" w:hAnsi="Times New Roman" w:cs="Times New Roman"/>
-          <w:rFonts w:ascii="Times New Roman" w:hAnsi="Times New Roman"/>
-          <w:b w:val="0"/>
-          <w:sz w:val="24"/>
-        </w:rPr>
-        <w:t>Documentation &amp;</w:t>
-      </w:r>
-    </w:p>
-    <w:p>
-      <w:pPr>
-        <w:jc w:val="both"/>
-        <w:spacing w:line="480" w:lineRule="auto" w:after="0"/>
-        <w:ind w:firstLine="285750"/>
-      </w:pPr>
-      <w:r>
-        <w:rPr>
-          <w:rFonts w:ascii="Times New Roman" w:hAnsi="Times New Roman" w:cs="Times New Roman"/>
-          <w:rFonts w:ascii="Times New Roman" w:hAnsi="Times New Roman"/>
-          <w:b w:val="0"/>
-          <w:sz w:val="24"/>
-        </w:rPr>
-        <w:t>Finalization      ──────────────────────────── ─── ─── ─── ─── ███ ███ ███  ────</w:t>
-      </w:r>
-    </w:p>
-    <w:p>
-      <w:pPr>
-        <w:jc w:val="both"/>
-        <w:spacing w:line="480" w:lineRule="auto" w:after="0"/>
-        <w:ind w:firstLine="285750"/>
-      </w:pPr>
-      <w:r>
-        <w:rPr>
-          <w:rFonts w:ascii="Times New Roman" w:hAnsi="Times New Roman" w:cs="Times New Roman"/>
-          <w:rFonts w:ascii="Times New Roman" w:hAnsi="Times New Roman"/>
-          <w:b w:val="0"/>
-          <w:sz w:val="24"/>
-        </w:rPr>
-        <w:t>─── ─── ─── ───      ─── ─── ─── ───      ─── ─── ─── ───      ─── ─── ───</w:t>
-      </w:r>
-    </w:p>
-    <w:p>
-      <w:pPr>
-        <w:jc w:val="both"/>
-        <w:spacing w:line="480" w:lineRule="auto" w:after="0"/>
-        <w:ind w:firstLine="285750"/>
-      </w:pPr>
-      <w:r>
-        <w:rPr>
-          <w:rFonts w:ascii="Times New Roman" w:hAnsi="Times New Roman" w:cs="Times New Roman"/>
-          <w:rFonts w:ascii="Times New Roman" w:hAnsi="Times New Roman"/>
-          <w:b w:val="0"/>
-          <w:sz w:val="24"/>
-        </w:rPr>
-        <w:t>MILESTONES</w:t>
-      </w:r>
-    </w:p>
-    <w:p>
-      <w:pPr>
-        <w:jc w:val="both"/>
-        <w:spacing w:line="480" w:lineRule="auto" w:after="0"/>
-        <w:ind w:firstLine="285750"/>
-      </w:pPr>
-      <w:r>
-        <w:rPr>
-          <w:rFonts w:ascii="Times New Roman" w:hAnsi="Times New Roman" w:cs="Times New Roman"/>
-          <w:rFonts w:ascii="Times New Roman" w:hAnsi="Times New Roman"/>
-          <w:b w:val="0"/>
-          <w:sz w:val="24"/>
-        </w:rPr>
-        <w:t>Title Defense     ▲                                            [Completed May 2026]</w:t>
-      </w:r>
-    </w:p>
-    <w:p>
-      <w:pPr>
-        <w:jc w:val="both"/>
-        <w:spacing w:line="480" w:lineRule="auto" w:after="0"/>
-        <w:ind w:firstLine="285750"/>
-      </w:pPr>
-      <w:r>
-        <w:rPr>
-          <w:rFonts w:ascii="Times New Roman" w:hAnsi="Times New Roman" w:cs="Times New Roman"/>
-          <w:rFonts w:ascii="Times New Roman" w:hAnsi="Times New Roman"/>
-          <w:b w:val="0"/>
-          <w:sz w:val="24"/>
-        </w:rPr>
-        <w:t>Proposal Defense                    ▲                          [Projected June 2026]</w:t>
-      </w:r>
-    </w:p>
-    <w:p>
-      <w:pPr>
-        <w:jc w:val="both"/>
-        <w:spacing w:line="480" w:lineRule="auto" w:after="0"/>
-        <w:ind w:firstLine="285750"/>
-      </w:pPr>
-      <w:r>
-        <w:rPr>
-          <w:rFonts w:ascii="Times New Roman" w:hAnsi="Times New Roman" w:cs="Times New Roman"/>
-          <w:rFonts w:ascii="Times New Roman" w:hAnsi="Times New Roman"/>
-          <w:b w:val="0"/>
-          <w:sz w:val="24"/>
-        </w:rPr>
-        <w:t>Final Defense                                         ▲        [Projected Aug 2026]</w:t>
-      </w:r>
-    </w:p>
-    <w:p>
-      <w:pPr>
-        <w:jc w:val="both"/>
-        <w:spacing w:line="480" w:lineRule="auto" w:after="0"/>
-        <w:ind w:firstLine="285750"/>
-      </w:pPr>
-      <w:r>
-        <w:rPr>
-          <w:rFonts w:ascii="Times New Roman" w:hAnsi="Times New Roman" w:cs="Times New Roman"/>
-          <w:rFonts w:ascii="Times New Roman" w:hAnsi="Times New Roman"/>
-          <w:b w:val="0"/>
-          <w:sz w:val="24"/>
-        </w:rPr>
-        <w:t>─── ─── ─── ───      ─── ─── ─── ───      ─── ─── ─── ───      ─── ─── ───</w:t>
-      </w:r>
-    </w:p>
-    <w:p>
-      <w:pPr>
-        <w:jc w:val="both"/>
-        <w:spacing w:line="480" w:lineRule="auto" w:after="0"/>
-        <w:ind w:firstLine="285750"/>
-      </w:pPr>
-      <w:r>
-        <w:rPr>
-          <w:rFonts w:ascii="Times New Roman" w:hAnsi="Times New Roman" w:cs="Times New Roman"/>
-          <w:rFonts w:ascii="Times New Roman" w:hAnsi="Times New Roman"/>
-          <w:b w:val="0"/>
-          <w:sz w:val="24"/>
-        </w:rPr>
-        <w:t>███ = Active work        ─── = No activity         ▲ = Milestone</w:t>
-      </w:r>
-    </w:p>
-    <w:p>
-      <w:pPr>
-        <w:jc w:val="both"/>
-        <w:spacing w:line="480" w:lineRule="auto" w:after="0"/>
-        <w:ind w:firstLine="285750"/>
-      </w:pPr>
-      <w:r>
-        <w:rPr>
-          <w:rFonts w:ascii="Times New Roman" w:hAnsi="Times New Roman" w:cs="Times New Roman"/>
-          <w:rFonts w:ascii="Times New Roman" w:hAnsi="Times New Roman"/>
-          <w:b w:val="0"/>
-          <w:sz w:val="24"/>
-        </w:rPr>
-        <w:t>Source: Adapted from ROADMAP.md — SecureCAT Capstone Timeline (2026)</w:t>
-      </w:r>
-    </w:p>
-    <w:p>
-      <w:pPr>
-        <w:jc w:val="both"/>
-        <w:spacing w:line="480" w:lineRule="auto" w:after="0"/>
-        <w:ind w:firstLine="285750"/>
-      </w:pPr>
-      <w:r>
-        <w:rPr>
-          <w:rFonts w:ascii="Times New Roman" w:hAnsi="Times New Roman" w:cs="Times New Roman"/>
-          <w:rFonts w:ascii="Times New Roman" w:hAnsi="Times New Roman"/>
-          <w:b w:val="0"/>
-          <w:sz w:val="24"/>
-        </w:rPr>
-        <w:t>```</w:t>
+        <w:t>Figure 3. Project Gantt Chart of SecureCAT: A Role-Based College Admission Testing System for the Guidance and Registrar Offices at ISPSC Tagudin</w:t>
       </w:r>
     </w:p>
     <w:p>
@@ -4116,21 +1298,6 @@
           <w:b/>
           <w:sz w:val="24"/>
         </w:rPr>
-        <w:t>Compliance verification</w:t>
-      </w:r>
-    </w:p>
-    <w:p>
-      <w:pPr>
-        <w:jc w:val="both"/>
-        <w:spacing w:line="480" w:lineRule="auto" w:after="0"/>
-      </w:pPr>
-      <w:r>
-        <w:rPr>
-          <w:rFonts w:ascii="Times New Roman" w:hAnsi="Times New Roman" w:cs="Times New Roman"/>
-          <w:rFonts w:ascii="Times New Roman" w:hAnsi="Times New Roman"/>
-          <w:b/>
-          <w:sz w:val="24"/>
-        </w:rPr>
         <w:t>Population and Locale of the Study</w:t>
       </w:r>
     </w:p>
@@ -4193,67 +1360,6 @@
           <w:b/>
           <w:sz w:val="24"/>
         </w:rPr>
-        <w:t>References used (Draft entries for CC-01 compilation)</w:t>
-      </w:r>
-    </w:p>
-    <w:p>
-      <w:pPr>
-        <w:jc w:val="both"/>
-        <w:spacing w:line="480" w:lineRule="auto" w:after="0"/>
-        <w:ind w:firstLine="285750"/>
-      </w:pPr>
-      <w:r>
-        <w:rPr>
-          <w:rFonts w:ascii="Times New Roman" w:hAnsi="Times New Roman" w:cs="Times New Roman"/>
-          <w:rFonts w:ascii="Times New Roman" w:hAnsi="Times New Roman"/>
-          <w:b w:val="0"/>
-          <w:sz w:val="24"/>
-        </w:rPr>
-        <w:t>Frey, B. B. (Ed.). (2022). The SAGE encyclopedia of research design (2nd ed.). SAGE Publications, Inc. https://doi.org/10.4135/9781071812082</w:t>
-      </w:r>
-    </w:p>
-    <w:p>
-      <w:pPr>
-        <w:jc w:val="both"/>
-        <w:spacing w:line="480" w:lineRule="auto" w:after="0"/>
-      </w:pPr>
-      <w:r>
-        <w:rPr>
-          <w:rFonts w:ascii="Times New Roman" w:hAnsi="Times New Roman" w:cs="Times New Roman"/>
-          <w:rFonts w:ascii="Times New Roman" w:hAnsi="Times New Roman"/>
-          <w:b/>
-          <w:sz w:val="24"/>
-        </w:rPr>
-        <w:t>Source verification log</w:t>
-      </w:r>
-    </w:p>
-    <w:p>
-      <w:pPr>
-        <w:jc w:val="both"/>
-        <w:spacing w:line="480" w:lineRule="auto" w:after="0"/>
-      </w:pPr>
-      <w:r>
-        <w:rPr>
-          <w:rFonts w:ascii="Times New Roman" w:hAnsi="Times New Roman" w:cs="Times New Roman"/>
-          <w:rFonts w:ascii="Times New Roman" w:hAnsi="Times New Roman"/>
-          <w:b/>
-          <w:sz w:val="24"/>
-        </w:rPr>
-        <w:t>Compliance verification</w:t>
-      </w:r>
-    </w:p>
-    <w:p>
-      <w:pPr>
-        <w:jc w:val="both"/>
-        <w:spacing w:line="480" w:lineRule="auto" w:after="0"/>
-      </w:pPr>
-      <w:r>
-        <w:rPr>
-          <w:rFonts w:ascii="Times New Roman" w:hAnsi="Times New Roman" w:cs="Times New Roman"/>
-          <w:rFonts w:ascii="Times New Roman" w:hAnsi="Times New Roman"/>
-          <w:b/>
-          <w:sz w:val="24"/>
-        </w:rPr>
         <w:t>Research Instruments</w:t>
       </w:r>
     </w:p>
@@ -4317,147 +1423,6 @@
           <w:b/>
           <w:sz w:val="24"/>
         </w:rPr>
-        <w:t>References used (Draft entries for CC-01 compilation)</w:t>
-      </w:r>
-    </w:p>
-    <w:p>
-      <w:pPr>
-        <w:jc w:val="both"/>
-        <w:spacing w:line="480" w:lineRule="auto" w:after="0"/>
-        <w:ind w:firstLine="285750"/>
-      </w:pPr>
-      <w:r>
-        <w:rPr>
-          <w:rFonts w:ascii="Times New Roman" w:hAnsi="Times New Roman" w:cs="Times New Roman"/>
-          <w:rFonts w:ascii="Times New Roman" w:hAnsi="Times New Roman"/>
-          <w:b w:val="0"/>
-          <w:sz w:val="24"/>
-        </w:rPr>
-        <w:t>Al-Qudah, M., &amp; Al-Sarrayriah, A. (2023). Evaluating task workload of administrative information systems in higher education using NASA-TLX. International Journal of Human-Computer Interaction, 39(8), 1645–1658. https://doi.org/10.1080/10447318.2023.2189012</w:t>
-      </w:r>
-    </w:p>
-    <w:p>
-      <w:pPr>
-        <w:jc w:val="both"/>
-        <w:spacing w:line="480" w:lineRule="auto" w:after="0"/>
-        <w:ind w:firstLine="285750"/>
-      </w:pPr>
-      <w:r>
-        <w:rPr>
-          <w:rFonts w:ascii="Times New Roman" w:hAnsi="Times New Roman" w:cs="Times New Roman"/>
-          <w:rFonts w:ascii="Times New Roman" w:hAnsi="Times New Roman"/>
-          <w:b w:val="0"/>
-          <w:sz w:val="24"/>
-        </w:rPr>
-        <w:t>Brooke, J. (1996). SUS: A quick and dirty usability scale. In P. W. Jordan, B. Thomas, I. L. McClelland, &amp; B. Weerdmeester (Eds.), Usability evaluation in industry (pp. 189–194). Taylor &amp; Francis.</w:t>
-      </w:r>
-    </w:p>
-    <w:p>
-      <w:pPr>
-        <w:jc w:val="both"/>
-        <w:spacing w:line="480" w:lineRule="auto" w:after="0"/>
-        <w:ind w:firstLine="285750"/>
-      </w:pPr>
-      <w:r>
-        <w:rPr>
-          <w:rFonts w:ascii="Times New Roman" w:hAnsi="Times New Roman" w:cs="Times New Roman"/>
-          <w:rFonts w:ascii="Times New Roman" w:hAnsi="Times New Roman"/>
-          <w:b w:val="0"/>
-          <w:sz w:val="24"/>
-        </w:rPr>
-        <w:t>Hart, S. G., &amp; Staveland, L. E. (1988). Development of NASA-TLX (Task Load Index): Results of empirical and theoretical research. Advances in Psychology, 52, 139–183. https://doi.org/10.1016/S0166-4115(08)62386-9</w:t>
-      </w:r>
-    </w:p>
-    <w:p>
-      <w:pPr>
-        <w:jc w:val="both"/>
-        <w:spacing w:line="480" w:lineRule="auto" w:after="0"/>
-        <w:ind w:firstLine="285750"/>
-      </w:pPr>
-      <w:r>
-        <w:rPr>
-          <w:rFonts w:ascii="Times New Roman" w:hAnsi="Times New Roman" w:cs="Times New Roman"/>
-          <w:rFonts w:ascii="Times New Roman" w:hAnsi="Times New Roman"/>
-          <w:b w:val="0"/>
-          <w:sz w:val="24"/>
-        </w:rPr>
-        <w:t>Loiacono, E. T., &amp; McCoy, S. (2024). Measuring cognitive workload and frustration in administrative software: A NASA-TLX validation study. Information Systems Journal, 34(3), 321–339. https://doi.org/10.1111/isj.12456</w:t>
-      </w:r>
-    </w:p>
-    <w:p>
-      <w:pPr>
-        <w:jc w:val="both"/>
-        <w:spacing w:line="480" w:lineRule="auto" w:after="0"/>
-        <w:ind w:firstLine="285750"/>
-      </w:pPr>
-      <w:r>
-        <w:rPr>
-          <w:rFonts w:ascii="Times New Roman" w:hAnsi="Times New Roman" w:cs="Times New Roman"/>
-          <w:rFonts w:ascii="Times New Roman" w:hAnsi="Times New Roman"/>
-          <w:b w:val="0"/>
-          <w:sz w:val="24"/>
-        </w:rPr>
-        <w:t>Safi, M., &amp; Elsayed, H. (2023). Usability evaluation of academic information systems: A validation study of the System Usability Scale. Journal of Systems and Software, 198, 111612. https://doi.org/10.1016/j.jss.2023.111612</w:t>
-      </w:r>
-    </w:p>
-    <w:p>
-      <w:pPr>
-        <w:jc w:val="both"/>
-        <w:spacing w:line="480" w:lineRule="auto" w:after="0"/>
-        <w:ind w:firstLine="285750"/>
-      </w:pPr>
-      <w:r>
-        <w:rPr>
-          <w:rFonts w:ascii="Times New Roman" w:hAnsi="Times New Roman" w:cs="Times New Roman"/>
-          <w:rFonts w:ascii="Times New Roman" w:hAnsi="Times New Roman"/>
-          <w:b w:val="0"/>
-          <w:sz w:val="24"/>
-        </w:rPr>
-        <w:t>Vlachogianni, P., &amp; Tselios, N. (2022). Perceived usability evaluation of e-learning platforms using the System Usability Scale. Education and Information Technologies, 27(2), 1735–1751. https://doi.org/10.1007/s10639-021-10683-x</w:t>
-      </w:r>
-    </w:p>
-    <w:p>
-      <w:pPr>
-        <w:jc w:val="both"/>
-        <w:spacing w:line="480" w:lineRule="auto" w:after="0"/>
-      </w:pPr>
-      <w:r>
-        <w:rPr>
-          <w:rFonts w:ascii="Times New Roman" w:hAnsi="Times New Roman" w:cs="Times New Roman"/>
-          <w:rFonts w:ascii="Times New Roman" w:hAnsi="Times New Roman"/>
-          <w:b/>
-          <w:sz w:val="24"/>
-        </w:rPr>
-        <w:t>Source verification log</w:t>
-      </w:r>
-    </w:p>
-    <w:p>
-      <w:pPr>
-        <w:jc w:val="both"/>
-        <w:spacing w:line="480" w:lineRule="auto" w:after="0"/>
-      </w:pPr>
-      <w:r>
-        <w:rPr>
-          <w:rFonts w:ascii="Times New Roman" w:hAnsi="Times New Roman" w:cs="Times New Roman"/>
-          <w:rFonts w:ascii="Times New Roman" w:hAnsi="Times New Roman"/>
-          <w:b/>
-          <w:sz w:val="24"/>
-        </w:rPr>
-        <w:t>Compliance verification</w:t>
-      </w:r>
-    </w:p>
-    <w:p>
-      <w:pPr>
-        <w:jc w:val="both"/>
-        <w:spacing w:line="480" w:lineRule="auto" w:after="0"/>
-      </w:pPr>
-      <w:r>
-        <w:rPr>
-          <w:rFonts w:ascii="Times New Roman" w:hAnsi="Times New Roman" w:cs="Times New Roman"/>
-          <w:rFonts w:ascii="Times New Roman" w:hAnsi="Times New Roman"/>
-          <w:b/>
-          <w:sz w:val="24"/>
-        </w:rPr>
         <w:t>Data Analysis</w:t>
       </w:r>
     </w:p>
@@ -4475,6 +1440,36 @@
           <w:sz w:val="24"/>
         </w:rPr>
         <w:t>The data analysis procedures for this study are structured around the three specific research objectives, with each objective assigned a distinct analytical approach appropriate to the type of data it generates. For the first specific objective, which seeks to identify existing admission testing processes, operational gaps, and coordination requirements at ISPSC Tagudin, qualitative thematic analysis will be applied to the interview transcripts gathered from the Registrar staff, Guidance staff, and Campus Director, as well as to the notes from applicant intercept surveys. The interview data will be transcribed, coded, and organized into themes corresponding to the study's research questions, including process bottlenecks, inter-office coordination failures, data integrity vulnerabilities, and infrastructure constraints. Observational notes collected during the campus visit will supplement the thematic analysis by providing contextual detail about physical workflows that interviews alone may not capture. For the second specific objective, which seeks to develop the SecureCAT system, design validation will be conducted through iterative user feedback collected during the development cycle. As each system module reaches a functional state, the research team will demonstrate the module to designated staff members at the Registrar and Guidance Offices and solicit structured feedback on usability, feature completeness, and alignment with their actual operational requirements. This iterative feedback loop ensures that the system design remains grounded in the confirmed needs of its end users rather than assumptions, and any design revisions prompted by user feedback will be documented as part of the developmental record. For the third specific objective, which seeks to evaluate the usability and perceived task workload of the developed system, descriptive statistics will be computed from the two research instruments: the System Usability Scale and the NASA Task Load Index. The SUS yields a single composite score ranging from 0 to 100, which will be interpreted using the established benchmark where scores above 68 are considered above average. The mean SUS score, standard deviation, and frequency distribution will be calculated and reported for each respondent group. The NASA-TLX produces six subscale scores — Mental Demand, Physical Demand, Temporal Demand, Performance, Effort, and Frustration — each rated on a scale from 0 to 100. The mean score for each subscale will be computed for each respondent group, along with the overall composite workload score. These descriptive statistics will quantify both the perceived ease of use and the perceived task burden that the system imposes on its operators, providing a dual-perspective evaluation that addresses usability and workload separately rather than conflating the two constructs. Statistical significance testing is not employed in this study, as the descriptive developmental research design with purposive sampling does not require inferential methods, and the respondent pool of approximately 8 to 12 participants is appropriately evaluated through descriptive measures alone.</w:t>
+      </w:r>
+    </w:p>
+    <w:p>
+      <w:pPr>
+        <w:jc w:val="center"/>
+        <w:spacing w:line="480" w:lineRule="auto" w:after="0"/>
+      </w:pPr>
+      <w:r>
+        <w:rPr>
+          <w:rFonts w:ascii="Times New Roman" w:hAnsi="Times New Roman" w:cs="Times New Roman"/>
+          <w:rFonts w:ascii="Times New Roman" w:hAnsi="Times New Roman"/>
+          <w:b/>
+          <w:sz w:val="24"/>
+        </w:rPr>
+        <w:t>Table 4. System Usability Scale Score Interpretation</w:t>
+      </w:r>
+    </w:p>
+    <w:p>
+      <w:pPr>
+        <w:jc w:val="center"/>
+        <w:spacing w:line="480" w:lineRule="auto" w:after="0"/>
+      </w:pPr>
+      <w:r>
+        <w:rPr>
+          <w:rFonts w:ascii="Times New Roman" w:hAnsi="Times New Roman" w:cs="Times New Roman"/>
+          <w:rFonts w:ascii="Times New Roman" w:hAnsi="Times New Roman"/>
+          <w:b/>
+          <w:sz w:val="24"/>
+        </w:rPr>
+        <w:t>Table 5. NASA Task Load Index Subscale Descriptions</w:t>
       </w:r>
     </w:p>
     <w:p>

</xml_diff>